<commit_message>
Trim review comments to items grounded in the paper
Co-Authored-By: Claude Sonnet 5.5 <noreply@anthropic.com>
Claude-Session: https://claude.ai/code/session_01W5KVGsn3NPSe2tZYET3Lj5
</commit_message>
<xml_diff>
--- a/审稿意见.docx
+++ b/审稿意见.docx
@@ -223,7 +223,7 @@
           <w:sz w:val="24"/>
           <w:szCs w:val="24"/>
         </w:rPr>
-        <w:t xml:space="preserve">1. 模型选择实验预先使用了模型类别信息。式(33)按模型类型分别设置稀疏惩罚：Giesekus模式惩罚ε，PTT模式惩罚α，Oldroyd-B模式同时惩罚两者。也就是说，哪些参数应被压缩为零，是由预设的模型类别决定的。这只能说明在给定模型假设下，无关参数可以被压缩到零，不能说明网络从未知数据中识别出了模型类别。第1.5.2节自身也使用了“在预设模型类别下”的限定，而摘要、第2.3节和结论却表述为三类模型被“自动甄别”“全部正确识别”，前后口径不一致。请作者说明实际使用时是否需要预先指定模型类别；若不需要，请用同一目标函数、同一初始化规则和同一选择准则，在隐藏模型标签的数据上验证，并增加交叉模型测试（例如Giesekus数据在PTT模式下训练）和ε、α均不为零的混合模型数据；若需要，则应相应修改题目、摘要和结论。另外，参数被压缩到10⁻⁶量级并不等于严格为零，“无需后验阈值”的说法与实际仍需区分“近零”和“非零”并不相符，请说明具体判定规则。</w:t>
+        <w:t xml:space="preserve">1. 模型选择实验预先使用了模型类别信息。式(33)按模型类型分别设置稀疏惩罚：Giesekus模式惩罚ε，PTT模式惩罚α，Oldroyd-B模式同时惩罚两者。也就是说，哪些参数应被压缩为零，是由预设的模型类别决定的。这只能说明在给定模型假设下，无关参数可以被压缩到零，不能说明网络从未知数据中识别出了模型类别。第1.5.2节自身也使用了“在预设模型类别下”的限定，而摘要、第2.3节和结论却表述为三类模型被“自动甄别”“全部正确识别”，前后口径不一致。请作者说明实际使用时是否需要预先指定模型类别；若不需要，请用同一目标函数、同一初始化规则和同一选择准则，在隐藏模型标签的数据上验证；若需要，则应相应修改题目、摘要和结论。另外，参数被压缩到10⁻⁶量级并不等于严格为零，“无需后验阈值”的说法与实际仍需区分“近零”和“非零”并不相符，请说明具体判定规则。</w:t>
       </w:r>
     </w:p>
     <w:p>
@@ -251,105 +251,77 @@
           <w:sz w:val="24"/>
           <w:szCs w:val="24"/>
         </w:rPr>
-        <w:t xml:space="preserve">3. ηp的可辨识性存在结构性问题。第一阶段仅有速度观测、一致性损失和应力初边值约束，内部应力没有数据。对式(3)，若同时令τ→cτ、ηp→cηp，则各项T1～T6均整体乘以c，逐点缩放因子S也同步放大，一致性损失（除10⁻³下限截断外）不变，该对称性只能靠先验和应力初边值条件破除。第二阶段又冻结τ与ηp，仅优化压力和ηs。这与“ηp锁定于先验”的现象吻合。第2.5节用式(47)比较∂L/∂ηs与∂L/∂λ来解释锁定，但第一阶段并未训练ηs，第二阶段又冻结了λ，二者并不在同一优化过程中竞争，该解释缺乏依据。请作者核查上述问题，并考虑将动量方程纳入联合训练。</w:t>
-      </w:r>
-    </w:p>
-    <w:p>
-      <w:pPr>
-        <w:spacing w:after="60" w:line="360"/>
-        <w:ind w:firstLine="480"/>
-      </w:pPr>
-      <w:r>
-        <w:rPr>
-          <w:rFonts w:ascii="Times New Roman" w:eastAsia="SimSun" w:hAnsi="Times New Roman"/>
-          <w:sz w:val="24"/>
-          <w:szCs w:val="24"/>
-        </w:rPr>
-        <w:t xml:space="preserve">4. 非线性参数ε、α的可辨识性缺少证据。算例中顶盖速度为U_wall=t，总时长仅0.03 s（约0.3倍松弛时间），顶盖最大速度只有0.03，实际有效Wi约为10⁻³量级，流动接近线性黏弹性响应。在这种条件下，PTT项和Giesekus项以及对流项、上随体项均为二阶小量，对速度场的影响很可能远小于10⁻⁴，而训练数据损失已降到10⁻⁷～10⁻⁶。在此情形下ε能被辨识到4.1%的误差，需要更有力的解释，否则应怀疑这是先验或优化过程所致。此外，Giesekus与PTT算例将ηs、ηp改为0.01（Re约50），与Oldroyd-B算例（Re=1）条件不同，文中未说明原因。请作者给出速度场对ε、α的灵敏度分析，增加将先验设在偏离真值处的对照，在更长时间、更大Wi或稳态条件下验证，并在同一设置下比较三类模型。</w:t>
-      </w:r>
-    </w:p>
-    <w:p>
-      <w:pPr>
-        <w:spacing w:after="60" w:line="360"/>
-        <w:ind w:firstLine="480"/>
-      </w:pPr>
-      <w:r>
-        <w:rPr>
-          <w:rFonts w:ascii="Times New Roman" w:eastAsia="SimSun" w:hAnsi="Times New Roman"/>
-          <w:sz w:val="24"/>
-          <w:szCs w:val="24"/>
-        </w:rPr>
-        <w:t xml:space="preserve">5. 关于松弛时间偏高的理论解释不充分。式(41)直接给出∂L_consistency/∂λ&lt;0对λ∈[0.1,2.0]成立，并据此解释λ上漂，英文摘要进一步称之为“理论可辨识性边界”，但正文没有给出足以支撑全区间单调性的推导或数值验证。按式(20)，T1可展开为τ/λ+(ε/ηp)tr(τ)τ，第二项并不显含λ；一致性损失分子是两个时刻的应力差，分母S又依赖F，归一化后损失在|ΔtF|远大于|τ|时趋于饱和，不能仅凭部分项含1/λ就推断损失单调下降。同时，文中未说明实现中是否对S停止梯度，这直接影响梯度分析。此外，λ最终收敛到0.39～0.50而非上界，也与“沿单调下降方向上行”的解释不完全吻合。请补充与实际实现一致的推导，或通过固定网络后的参数扫描、重新优化其余变量后的损失剖面、时间步长敏感性以及S是否停止梯度的对照实验来检验。特定训练方案未能恢复参数，并不等同于参数在理论上不可辨识，在排除离散误差、归一化不一致和优化偏差之前，应将相关表述限定为当前设置下观察到的辨识困难。式(43)、(47)、(48)的量级论证也应给出推导或数值证据。</w:t>
-      </w:r>
-    </w:p>
-    <w:p>
-      <w:pPr>
-        <w:spacing w:after="60" w:line="360"/>
-        <w:ind w:firstLine="480"/>
-      </w:pPr>
-      <w:r>
-        <w:rPr>
-          <w:rFonts w:ascii="Times New Roman" w:eastAsia="SimSun" w:hAnsi="Times New Roman"/>
-          <w:sz w:val="24"/>
-          <w:szCs w:val="24"/>
-        </w:rPr>
-        <w:t xml:space="preserve">6. 瞬态控制方程与时间递推的描述不统一。第1.1节称“在本文稳态框架下忽略时间导数”，而算例是瞬态的，网络输入含t，第1.4.2节的一致性损失本身就是对∂τ/∂t的离散。请明确式(19)中的F是完整本构残差还是不含∂τ/∂t的算子，并给出从瞬态本构方程到式(18)的完整推导，同时说明采用标准化时间步长Δt_phys/σ_t后，时间导数与空间导数的尺度变换如何保持一致。另外，摘要和引言中“以时间递推替代高阶空间导数”的说法不准确：本构方程只含一阶空间导数，T2=u·∇τ仍需对应力网络求空间导数，被替换的只是∂τ/∂t。该做法本质上是隐式欧拉时间离散，属于已有思路，应准确表述创新点并引用离散时间PINN等相关工作。此外，文中列出了不可压缩条件，但两个阶段的损失中均未出现连续性方程残差，也未说明是否采用硬约束，请补充。</w:t>
-      </w:r>
-    </w:p>
-    <w:p>
-      <w:pPr>
-        <w:spacing w:after="60" w:line="360"/>
-        <w:ind w:firstLine="480"/>
-      </w:pPr>
-      <w:r>
-        <w:rPr>
-          <w:rFonts w:ascii="Times New Roman" w:eastAsia="SimSun" w:hAnsi="Times New Roman"/>
-          <w:sz w:val="24"/>
-          <w:szCs w:val="24"/>
-        </w:rPr>
-        <w:t xml:space="preserve">7. 训练所用信息与“仅依赖稀疏速度观测”的表述不符。损失函数同时使用了应力初值、壁面及进出口应力参考值和压力参考值，并在训练前用全场数据预计算速度、应力、压力的标准差；参考数据为COMSOL生成的1.29×10⁵个稠密无噪声点。这些信息在真实实验中大多无法获得。请逐项区分实际观测数据、已知初边值条件、独立先验信息和仅用于验证的参考解，并回答：应力边界值是否直接取自COMSOL参考解、使用范围和采样量如何；σ_τ、σ_p是否由不可观测的完整真实场计算，去除后方法表现如何；封闭方腔中损失函数里的inlet、outlet和“压力出口”条件对应哪些区域。摘要关于“可与粒子图像测速直接衔接”的表述，在未增加观测噪声和采样密度变化的验证前，只能作为潜在应用方向。</w:t>
-      </w:r>
-    </w:p>
-    <w:p>
-      <w:pPr>
-        <w:spacing w:after="60" w:line="360"/>
-        <w:ind w:firstLine="480"/>
-      </w:pPr>
-      <w:r>
-        <w:rPr>
-          <w:rFonts w:ascii="Times New Roman" w:eastAsia="SimSun" w:hAnsi="Times New Roman"/>
-          <w:sz w:val="24"/>
-          <w:szCs w:val="24"/>
-        </w:rPr>
-        <w:t xml:space="preserve">8. 数据设置与测试方案存在问题。第2.1节同时给出T=0.03 s、输出间隔Δt=0.01 s和16个快照，按等间隔理解三者不能同时成立（只有4个时刻），请列出实际输出时刻，并区分数值求解步长、数据保存间隔和一致性损失所用时间步长。测试集取t=0快照，而该时刻全域为零且已用于初始条件约束，这样的测试不能评价重建精度，应在未参与拟合的非零时刻或空间位置验证，并区分观测点留出、时空插值和时间外推。摘要中“约6500个时空采样点”与第2.2节“1.29×10⁵个时空点”也需要对应说明，请分别给出参考数据总量、速度观测点数、物理配置点数、初边值点数和独立测试点数。第2.4节题为“场量预测对比”，实际仅展示训练损失，缺少速度、应力、压力的参考场、预测场、误差场及相对L2误差等定量比较。</w:t>
-      </w:r>
-    </w:p>
-    <w:p>
-      <w:pPr>
-        <w:spacing w:after="60" w:line="360"/>
-        <w:ind w:firstLine="480"/>
-      </w:pPr>
-      <w:r>
-        <w:rPr>
-          <w:rFonts w:ascii="Times New Roman" w:eastAsia="SimSun" w:hAnsi="Times New Roman"/>
-          <w:sz w:val="24"/>
-          <w:szCs w:val="24"/>
-        </w:rPr>
-        <w:t xml:space="preserve">9. 动态损失权重的公式与所述作用不一致。式(36)和(37)对数据损失和一致性损失乘以同一个s_dyn，两者的有效权重之比恒等于初始权重之比（按式(45)恒为2:5），并不随训练进度变化，这与“训练初期由数据项主导、后期物理约束充分激活”的解释不符。实际随进度变化的只有初始条件权重，以及未乘s_dyn的先验项、稀疏项相对数据项的比重（初期相对放大约10倍），后者还可能与λ被先验牵引有关。请核对公式与代码，说明该调度究竟改变了哪些项之间的相对关系，并提供各项加权损失或梯度贡献随训练进度变化的曲线。</w:t>
-      </w:r>
-    </w:p>
-    <w:p>
-      <w:pPr>
-        <w:spacing w:after="60" w:line="360"/>
-        <w:ind w:firstLine="480"/>
-      </w:pPr>
-      <w:r>
-        <w:rPr>
-          <w:rFonts w:ascii="Times New Roman" w:eastAsia="SimSun" w:hAnsi="Times New Roman"/>
-          <w:sz w:val="24"/>
-          <w:szCs w:val="24"/>
-        </w:rPr>
-        <w:t xml:space="preserve">10. “增强”效果缺少基线比较和针对性消融。文章以ViscoelasticNet为主要比较对象，并宣称逐点缩放“优于传统全局方差缩放”，但未在相同数据和训练预算下给出直接比较。第2.5节的实验只围绕先验设置展开，没有对参数变换、稀疏正则化、动态调度、逐点缩放和梯度缩放各自的贡献做消融，与引言所述“四项消融实验系统评估了上述策略”不符。不同缩放方式下的损失值也不宜直接作为精度优劣的证据，应在统一测试集上用相同的场误差和物理残差指标比较。此外，所有结果均为单次运行，“24组鲁棒性实验无发散”也未列出具体配置，请报告多随机种子的均值、标准差和失败比例。</w:t>
+        <w:t xml:space="preserve">3. 关于松弛时间偏高的理论解释不充分。式(41)直接给出∂L_consistency/∂λ&lt;0对λ∈[0.1,2.0]成立，并据此解释λ上漂，英文摘要进一步称之为“理论可辨识性边界”，但正文没有给出足以支撑全区间单调性的推导或数值验证。按式(20)，T1可展开为τ/λ+(ε/ηp)tr(τ)τ，第二项并不显含λ；一致性损失分子是两个时刻的应力差，分母S又依赖F，不能仅凭部分项含1/λ就推断归一化损失必然随λ单调下降。同时，文中未说明实现中是否对S停止梯度，这直接影响梯度分析。请补充与实际实现一致的推导，或通过固定网络后的参数扫描、重新优化其余变量后的损失剖面、时间步长敏感性以及S是否停止梯度的对照实验来检验。特定训练方案未能恢复参数，并不等同于参数在理论上不可辨识，在排除离散误差、归一化不一致和优化偏差之前，应将相关表述限定为当前设置下观察到的辨识困难。</w:t>
+      </w:r>
+    </w:p>
+    <w:p>
+      <w:pPr>
+        <w:spacing w:after="60" w:line="360"/>
+        <w:ind w:firstLine="480"/>
+      </w:pPr>
+      <w:r>
+        <w:rPr>
+          <w:rFonts w:ascii="Times New Roman" w:eastAsia="SimSun" w:hAnsi="Times New Roman"/>
+          <w:sz w:val="24"/>
+          <w:szCs w:val="24"/>
+        </w:rPr>
+        <w:t xml:space="preserve">4. 瞬态控制方程与时间递推的描述不统一。第1.1节称“在本文稳态框架下忽略时间导数”，而算例是瞬态的，网络输入含t，第1.4.2节的一致性损失本身就是对∂τ/∂t的离散。请明确式(19)中的F是完整本构残差还是不含∂τ/∂t的算子，并给出从瞬态本构方程到式(18)的完整推导，同时说明采用标准化时间步长Δt_phys/σ_t后，时间导数与空间导数的尺度变换如何保持一致。另外，摘要和引言中“以时间递推替代高阶空间导数”的说法不准确：本构方程只含一阶空间导数，T2=u·∇τ仍需对应力网络求空间导数，被替换的只是∂τ/∂t。请据此修正相关表述。此外，文中列出了不可压缩条件，但两个阶段的损失中均未出现连续性方程残差，也未说明是否采用硬约束，请补充。</w:t>
+      </w:r>
+    </w:p>
+    <w:p>
+      <w:pPr>
+        <w:spacing w:after="60" w:line="360"/>
+        <w:ind w:firstLine="480"/>
+      </w:pPr>
+      <w:r>
+        <w:rPr>
+          <w:rFonts w:ascii="Times New Roman" w:eastAsia="SimSun" w:hAnsi="Times New Roman"/>
+          <w:sz w:val="24"/>
+          <w:szCs w:val="24"/>
+        </w:rPr>
+        <w:t xml:space="preserve">5. 训练所用信息与“仅依赖稀疏速度观测”的表述不符。损失函数同时使用了应力初值、壁面及进出口应力参考值和压力参考值，并在训练前用全场数据预计算速度、应力、压力的标准差；参考数据为COMSOL生成的1.29×10⁵个稠密无噪声点。这些信息在真实实验中大多无法获得。请逐项区分实际观测数据、已知初边值条件、独立先验信息和仅用于验证的参考解，并回答：应力边界值是否直接取自COMSOL参考解、使用范围和采样量如何；σ_τ、σ_p是否由不可观测的完整真实场计算，去除后方法表现如何；封闭方腔中损失函数里的inlet、outlet和“压力出口”条件对应哪些区域。摘要关于“可与粒子图像测速直接衔接”的表述，在未增加观测噪声和采样密度变化的验证前，应限定为潜在应用方向。</w:t>
+      </w:r>
+    </w:p>
+    <w:p>
+      <w:pPr>
+        <w:spacing w:after="60" w:line="360"/>
+        <w:ind w:firstLine="480"/>
+      </w:pPr>
+      <w:r>
+        <w:rPr>
+          <w:rFonts w:ascii="Times New Roman" w:eastAsia="SimSun" w:hAnsi="Times New Roman"/>
+          <w:sz w:val="24"/>
+          <w:szCs w:val="24"/>
+        </w:rPr>
+        <w:t xml:space="preserve">6. 数据设置与测试方案存在问题。第2.1节同时给出T=0.03 s、输出间隔Δt=0.01 s和16个快照，按等间隔理解三者不能同时成立，请列出实际输出时刻，并区分数值求解步长、数据保存间隔和一致性损失所用时间步长。测试集取t=0快照，而该时刻全域为零且已用于初始条件约束，这样的测试不能评价重建精度，应在未参与拟合的非零时刻或空间位置验证，并区分观测点留出、时空插值和时间外推。摘要中“约6500个时空采样点”与第2.2节“1.29×10⁵个时空点”也需要对应说明，请分别给出参考数据总量、速度观测点数、物理配置点数、初边值点数和独立测试点数。第2.4节题为“场量预测对比”，实际仅展示训练损失，缺少速度、应力、压力的参考场、预测场、误差场及相对L2误差等定量比较。</w:t>
+      </w:r>
+    </w:p>
+    <w:p>
+      <w:pPr>
+        <w:spacing w:after="60" w:line="360"/>
+        <w:ind w:firstLine="480"/>
+      </w:pPr>
+      <w:r>
+        <w:rPr>
+          <w:rFonts w:ascii="Times New Roman" w:eastAsia="SimSun" w:hAnsi="Times New Roman"/>
+          <w:sz w:val="24"/>
+          <w:szCs w:val="24"/>
+        </w:rPr>
+        <w:t xml:space="preserve">7. 动态损失权重的公式与所述作用不一致。式(36)和(37)对数据损失和一致性损失乘以同一个s_dyn，两者的有效权重之比恒等于初始权重之比（按式(45)恒为2:5），并不随训练进度变化，这与“训练初期由数据项主导、后期物理约束充分激活”的解释不符。实际随进度变化的只有初始条件权重，而且初始条件权重在训练初期并未被降低，而是随后逐渐衰减，也与文中描述不符。请核对公式与代码，说明该调度究竟改变了哪些项之间的相对关系，并提供各项加权损失或梯度贡献随训练进度变化的曲线。</w:t>
+      </w:r>
+    </w:p>
+    <w:p>
+      <w:pPr>
+        <w:spacing w:after="60" w:line="360"/>
+        <w:ind w:firstLine="480"/>
+      </w:pPr>
+      <w:r>
+        <w:rPr>
+          <w:rFonts w:ascii="Times New Roman" w:eastAsia="SimSun" w:hAnsi="Times New Roman"/>
+          <w:sz w:val="24"/>
+          <w:szCs w:val="24"/>
+        </w:rPr>
+        <w:t xml:space="preserve">8. “增强”效果缺少基线比较和针对性消融。文章以ViscoelasticNet为主要比较对象，并宣称逐点缩放“优于传统全局方差缩放”，但未在相同数据和训练预算下给出直接比较。第2.5节的实验只围绕先验设置展开，没有对参数变换、稀疏正则化、动态调度、逐点缩放和梯度缩放各自的贡献做消融，与引言所述“四项消融实验系统评估了上述策略”不符。不同缩放方式下的损失值也不宜直接作为精度优劣的证据，应在统一测试集上用相同的场误差和物理残差指标比较。此外，所有结果均为单次运行，“24组鲁棒性实验无发散”也未列出具体配置，请报告多随机种子的均值、标准差和失败比例。</w:t>
       </w:r>
     </w:p>
     <w:p>
@@ -418,7 +390,7 @@
           <w:sz w:val="24"/>
           <w:szCs w:val="24"/>
         </w:rPr>
-        <w:t xml:space="preserve">4. 非有限导数置零、F裁剪至±10⁶、全局梯度裁剪以及式(9)的参数特异梯度缩放，都可能改变实际被优化的残差。请报告这些机制的触发频率（尤其训练后期），并说明式(9)中clip(ηp,0.1,2.0)的依据。</w:t>
+        <w:t xml:space="preserve">4. 非有限导数置零、F裁剪至±10⁶、全局梯度裁剪以及式(9)的参数特异梯度缩放，都可能改变实际被优化的残差。请报告这些机制的触发频率（尤其训练后期），并给出未经这些处理的独立残差检查。</w:t>
       </w:r>
     </w:p>
     <w:p>
@@ -446,7 +418,7 @@
           <w:sz w:val="24"/>
           <w:szCs w:val="24"/>
         </w:rPr>
-        <w:t xml:space="preserve">6. 英文摘要中的“ViscoelasticNet++”未见于中文摘要和正文，请统一并说明与ViscoelasticNet的关系；请核实对文献[13]局限性（缺乏正性约束、依赖后验阈值）的描述是否与原文一致；引言中损失加权部分（文献[21]～[27]）篇幅较长而正文未做对比，建议压缩，并补充本构发现方向的相关工作（如EUCLID、SINDy/PDE-FIND等）；“黏/粘”“伸长/伸展性”等术语请统一；建议增加局限性讨论。</w:t>
+        <w:t xml:space="preserve">6. 英文摘要中的“ViscoelasticNet++”未见于中文摘要和正文，请统一，并说明其与ViscoelasticNet的关系；“黏/粘”“伸长/伸展性”等术语请统一。</w:t>
       </w:r>
     </w:p>
     <w:p>
@@ -474,20 +446,6 @@
           <w:szCs w:val="24"/>
         </w:rPr>
         <w:t xml:space="preserve">本文研究的问题有意义，方法组合具有一定工程价值，但目前的实验尚不能支撑“自动模型甄别”“高精度参数辨识”“理论可辨识性边界”以及“可直接对接实验”等核心结论。需要优先回答三个问题：模型类别是否真正由未知数据识别；参数估计是否有独立于正确先验的数据证据；松弛时间的偏差是否经过与实际实现一致的分析。上述问题涉及方法与结论的有效性，不能仅靠文字修改解决。建议作者完成方法核验、补充关键对照实验并相应收缩结论后，提交修改稿重审。</w:t>
-      </w:r>
-    </w:p>
-    <w:p>
-      <w:pPr>
-        <w:spacing w:before="300"/>
-        <w:jc w:val="right"/>
-      </w:pPr>
-      <w:r>
-        <w:rPr>
-          <w:rFonts w:ascii="Times New Roman" w:eastAsia="SimSun" w:hAnsi="Times New Roman"/>
-          <w:sz w:val="24"/>
-          <w:szCs w:val="24"/>
-        </w:rPr>
-        <w:t xml:space="preserve">审稿人：__________    日期：__________</w:t>
       </w:r>
     </w:p>
     <w:sectPr>

</xml_diff>

<commit_message>
Merge and polish review comments
Co-Authored-By: Claude Sonnet 5.5 <noreply@anthropic.com>
Claude-Session: https://claude.ai/code/session_01W5KVGsn3NPSe2tZYET3Lj5
</commit_message>
<xml_diff>
--- a/审稿意见.docx
+++ b/审稿意见.docx
@@ -160,16 +160,16 @@
     </w:p>
     <w:p>
       <w:pPr>
-        <w:spacing w:after="60" w:line="360"/>
-        <w:ind w:firstLine="480"/>
-      </w:pPr>
-      <w:r>
-        <w:rPr>
-          <w:rFonts w:ascii="Times New Roman" w:eastAsia="SimSun" w:hAnsi="Times New Roman"/>
-          <w:sz w:val="24"/>
-          <w:szCs w:val="24"/>
-        </w:rPr>
-        <w:t xml:space="preserve">本文针对黏弹性流体本构模型选择与参数辨识问题，在统一本构方程下（Oldroyd-B、Giesekus、线性PTT），提出了一种增强型物理信息神经网络框架。主要做法包括：对物理参数施加指数/softplus变换以保证正性，在对数空间引入高斯弱先验，按模型类别施加动态稀疏正则化，设计随训练进度变化的损失权重调度，以及以时间递推构造、逐点自适应缩放的本构一致性损失。作者以二维瞬态顶盖驱动方腔流为算例，报告三类模型均被正确识别，黏度参数误差低于5%，PTT伸长参数误差为4.1%，并通过先验消融和先验权重扫描讨论了松弛时间的辨识困难。</w:t>
+        <w:spacing w:after="80" w:line="360"/>
+        <w:ind w:firstLine="480"/>
+      </w:pPr>
+      <w:r>
+        <w:rPr>
+          <w:rFonts w:ascii="Times New Roman" w:eastAsia="SimSun" w:hAnsi="Times New Roman"/>
+          <w:sz w:val="24"/>
+          <w:szCs w:val="24"/>
+        </w:rPr>
+        <w:t xml:space="preserve">本文针对黏弹性流体本构模型选择与参数辨识问题，在统一本构方程下（Oldroyd-B、Giesekus、线性PTT）提出了一种增强型物理信息神经网络框架，主要包括参数正性变换、对数–高斯先验、动态稀疏正则化、动态损失权重调度，以及逐点自适应缩放的本构一致性损失。作者以二维瞬态顶盖驱动方腔流为算例，报告三类模型均被正确识别，并讨论了先验对参数收敛的影响。</w:t>
       </w:r>
     </w:p>
     <w:p>
@@ -187,16 +187,16 @@
     </w:p>
     <w:p>
       <w:pPr>
-        <w:spacing w:after="60" w:line="360"/>
-        <w:ind w:firstLine="480"/>
-      </w:pPr>
-      <w:r>
-        <w:rPr>
-          <w:rFonts w:ascii="Times New Roman" w:eastAsia="SimSun" w:hAnsi="Times New Roman"/>
-          <w:sz w:val="24"/>
-          <w:szCs w:val="24"/>
-        </w:rPr>
-        <w:t xml:space="preserve">该问题属于计算流变学中的反问题，具有明确的研究价值。文章对参数正性约束、损失量级平衡和训练数值稳定性做了较细致的工程处理，对先验缺失、先验偏离和先验权重敏感性的分析也有参考意义。但就目前的实验设计和结果而言，摘要与结论中的两项核心主张，即“自动模型甄别”和“可靠的参数辨识”，尚缺乏充分证据。此外，正文在方程表述、数据设置、测试方案以及数值引用上存在多处不一致。具体意见如下。</w:t>
+        <w:spacing w:after="80" w:line="360"/>
+        <w:ind w:firstLine="480"/>
+      </w:pPr>
+      <w:r>
+        <w:rPr>
+          <w:rFonts w:ascii="Times New Roman" w:eastAsia="SimSun" w:hAnsi="Times New Roman"/>
+          <w:sz w:val="24"/>
+          <w:szCs w:val="24"/>
+        </w:rPr>
+        <w:t xml:space="preserve">该问题属于计算流变学中的反问题，具有较好的研究价值。文章在参数约束、损失量级平衡和训练稳定性方面做了较细致的工作，对先验缺失、偏离及权重敏感性的讨论也有参考意义。但就现有实验而言，“自动模型甄别”和“可靠的参数辨识”两项主要结论的证据还不够充分，部分方程表述、数据设置和数值引用也有不一致之处。建议作者针对以下问题修改。</w:t>
       </w:r>
     </w:p>
     <w:p>
@@ -209,119 +209,161 @@
           <w:sz w:val="26"/>
           <w:szCs w:val="26"/>
         </w:rPr>
-        <w:t xml:space="preserve">三、主要问题</w:t>
-      </w:r>
-    </w:p>
-    <w:p>
-      <w:pPr>
-        <w:spacing w:after="60" w:line="360"/>
-        <w:ind w:firstLine="480"/>
-      </w:pPr>
-      <w:r>
-        <w:rPr>
-          <w:rFonts w:ascii="Times New Roman" w:eastAsia="SimSun" w:hAnsi="Times New Roman"/>
-          <w:sz w:val="24"/>
-          <w:szCs w:val="24"/>
-        </w:rPr>
-        <w:t xml:space="preserve">1. 模型选择实验预先使用了模型类别信息。式(33)按模型类型分别设置稀疏惩罚：Giesekus模式惩罚ε，PTT模式惩罚α，Oldroyd-B模式同时惩罚两者。也就是说，哪些参数应被压缩为零，是由预设的模型类别决定的。这只能说明在给定模型假设下，无关参数可以被压缩到零，不能说明网络从未知数据中识别出了模型类别。第1.5.2节自身也使用了“在预设模型类别下”的限定，而摘要、第2.3节和结论却表述为三类模型被“自动甄别”“全部正确识别”，前后口径不一致。请作者说明实际使用时是否需要预先指定模型类别；若不需要，请用同一目标函数、同一初始化规则和同一选择准则，在隐藏模型标签的数据上验证；若需要，则应相应修改题目、摘要和结论。另外，参数被压缩到10⁻⁶量级并不等于严格为零，“无需后验阈值”的说法与实际仍需区分“近零”和“非零”并不相符，请说明具体判定规则。</w:t>
-      </w:r>
-    </w:p>
-    <w:p>
-      <w:pPr>
-        <w:spacing w:after="60" w:line="360"/>
-        <w:ind w:firstLine="480"/>
-      </w:pPr>
-      <w:r>
-        <w:rPr>
-          <w:rFonts w:ascii="Times New Roman" w:eastAsia="SimSun" w:hAnsi="Times New Roman"/>
-          <w:sz w:val="24"/>
-          <w:szCs w:val="24"/>
-        </w:rPr>
-        <w:t xml:space="preserve">2. 参数辨识精度被高估，先验与数据的贡献无法区分。按文中真值和表1计算，三种模型的松弛时间λ相对误差分别约为289%、286%和400%，Giesekus模型α=0.1614相对真值0.2的误差为19.3%，这与摘要和结论中对参数辨识效果的概括性评价不符。结论称先验权重取5×10⁻⁴～10⁻³时“全部参数收敛至真值附近”，但表2中该区间λ为0.42～0.56，仍明显偏离真值0.1。更重要的是，表1中ηp=0.9000、ηs=0.1000与真值在四位有效数字上完全相同，而第2.5节又指出先验偏离真值20%～100%时黏度参数会完全锁定在先验值，因此黏度的小误差究竟来自数据还是来自设在真值上的先验，目前无法判断。请作者列出各参数先验均值、权重、取值依据及初始化方式，说明先验是否来自独立信息而非基准算例真值，补充先验偏离和无先验条件下的对照及重复训练结果，并在摘要和结论中分别评价黏度、松弛时间和非线性参数的辨识表现。</w:t>
-      </w:r>
-    </w:p>
-    <w:p>
-      <w:pPr>
-        <w:spacing w:after="60" w:line="360"/>
-        <w:ind w:firstLine="480"/>
-      </w:pPr>
-      <w:r>
-        <w:rPr>
-          <w:rFonts w:ascii="Times New Roman" w:eastAsia="SimSun" w:hAnsi="Times New Roman"/>
-          <w:sz w:val="24"/>
-          <w:szCs w:val="24"/>
-        </w:rPr>
-        <w:t xml:space="preserve">3. 关于松弛时间偏高的理论解释不充分。式(41)直接给出∂L_consistency/∂λ&lt;0对λ∈[0.1,2.0]成立，并据此解释λ上漂，英文摘要进一步称之为“理论可辨识性边界”，但正文没有给出足以支撑全区间单调性的推导或数值验证。按式(20)，T1可展开为τ/λ+(ε/ηp)tr(τ)τ，第二项并不显含λ；一致性损失分子是两个时刻的应力差，分母S又依赖F，不能仅凭部分项含1/λ就推断归一化损失必然随λ单调下降。同时，文中未说明实现中是否对S停止梯度，这直接影响梯度分析。请补充与实际实现一致的推导，或通过固定网络后的参数扫描、重新优化其余变量后的损失剖面、时间步长敏感性以及S是否停止梯度的对照实验来检验。特定训练方案未能恢复参数，并不等同于参数在理论上不可辨识，在排除离散误差、归一化不一致和优化偏差之前，应将相关表述限定为当前设置下观察到的辨识困难。</w:t>
-      </w:r>
-    </w:p>
-    <w:p>
-      <w:pPr>
-        <w:spacing w:after="60" w:line="360"/>
-        <w:ind w:firstLine="480"/>
-      </w:pPr>
-      <w:r>
-        <w:rPr>
-          <w:rFonts w:ascii="Times New Roman" w:eastAsia="SimSun" w:hAnsi="Times New Roman"/>
-          <w:sz w:val="24"/>
-          <w:szCs w:val="24"/>
-        </w:rPr>
-        <w:t xml:space="preserve">4. 瞬态控制方程与时间递推的描述不统一。第1.1节称“在本文稳态框架下忽略时间导数”，而算例是瞬态的，网络输入含t，第1.4.2节的一致性损失本身就是对∂τ/∂t的离散。请明确式(19)中的F是完整本构残差还是不含∂τ/∂t的算子，并给出从瞬态本构方程到式(18)的完整推导，同时说明采用标准化时间步长Δt_phys/σ_t后，时间导数与空间导数的尺度变换如何保持一致。另外，摘要和引言中“以时间递推替代高阶空间导数”的说法不准确：本构方程只含一阶空间导数，T2=u·∇τ仍需对应力网络求空间导数，被替换的只是∂τ/∂t。请据此修正相关表述。此外，文中列出了不可压缩条件，但两个阶段的损失中均未出现连续性方程残差，也未说明是否采用硬约束，请补充。</w:t>
-      </w:r>
-    </w:p>
-    <w:p>
-      <w:pPr>
-        <w:spacing w:after="60" w:line="360"/>
-        <w:ind w:firstLine="480"/>
-      </w:pPr>
-      <w:r>
-        <w:rPr>
-          <w:rFonts w:ascii="Times New Roman" w:eastAsia="SimSun" w:hAnsi="Times New Roman"/>
-          <w:sz w:val="24"/>
-          <w:szCs w:val="24"/>
-        </w:rPr>
-        <w:t xml:space="preserve">5. 训练所用信息与“仅依赖稀疏速度观测”的表述不符。损失函数同时使用了应力初值、壁面及进出口应力参考值和压力参考值，并在训练前用全场数据预计算速度、应力、压力的标准差；参考数据为COMSOL生成的1.29×10⁵个稠密无噪声点。这些信息在真实实验中大多无法获得。请逐项区分实际观测数据、已知初边值条件、独立先验信息和仅用于验证的参考解，并回答：应力边界值是否直接取自COMSOL参考解、使用范围和采样量如何；σ_τ、σ_p是否由不可观测的完整真实场计算，去除后方法表现如何；封闭方腔中损失函数里的inlet、outlet和“压力出口”条件对应哪些区域。摘要关于“可与粒子图像测速直接衔接”的表述，在未增加观测噪声和采样密度变化的验证前，应限定为潜在应用方向。</w:t>
-      </w:r>
-    </w:p>
-    <w:p>
-      <w:pPr>
-        <w:spacing w:after="60" w:line="360"/>
-        <w:ind w:firstLine="480"/>
-      </w:pPr>
-      <w:r>
-        <w:rPr>
-          <w:rFonts w:ascii="Times New Roman" w:eastAsia="SimSun" w:hAnsi="Times New Roman"/>
-          <w:sz w:val="24"/>
-          <w:szCs w:val="24"/>
-        </w:rPr>
-        <w:t xml:space="preserve">6. 数据设置与测试方案存在问题。第2.1节同时给出T=0.03 s、输出间隔Δt=0.01 s和16个快照，按等间隔理解三者不能同时成立，请列出实际输出时刻，并区分数值求解步长、数据保存间隔和一致性损失所用时间步长。测试集取t=0快照，而该时刻全域为零且已用于初始条件约束，这样的测试不能评价重建精度，应在未参与拟合的非零时刻或空间位置验证，并区分观测点留出、时空插值和时间外推。摘要中“约6500个时空采样点”与第2.2节“1.29×10⁵个时空点”也需要对应说明，请分别给出参考数据总量、速度观测点数、物理配置点数、初边值点数和独立测试点数。第2.4节题为“场量预测对比”，实际仅展示训练损失，缺少速度、应力、压力的参考场、预测场、误差场及相对L2误差等定量比较。</w:t>
-      </w:r>
-    </w:p>
-    <w:p>
-      <w:pPr>
-        <w:spacing w:after="60" w:line="360"/>
-        <w:ind w:firstLine="480"/>
-      </w:pPr>
-      <w:r>
-        <w:rPr>
-          <w:rFonts w:ascii="Times New Roman" w:eastAsia="SimSun" w:hAnsi="Times New Roman"/>
-          <w:sz w:val="24"/>
-          <w:szCs w:val="24"/>
-        </w:rPr>
-        <w:t xml:space="preserve">7. 动态损失权重的公式与所述作用不一致。式(36)和(37)对数据损失和一致性损失乘以同一个s_dyn，两者的有效权重之比恒等于初始权重之比（按式(45)恒为2:5），并不随训练进度变化，这与“训练初期由数据项主导、后期物理约束充分激活”的解释不符。实际随进度变化的只有初始条件权重，而且初始条件权重在训练初期并未被降低，而是随后逐渐衰减，也与文中描述不符。请核对公式与代码，说明该调度究竟改变了哪些项之间的相对关系，并提供各项加权损失或梯度贡献随训练进度变化的曲线。</w:t>
-      </w:r>
-    </w:p>
-    <w:p>
-      <w:pPr>
-        <w:spacing w:after="60" w:line="360"/>
-        <w:ind w:firstLine="480"/>
-      </w:pPr>
-      <w:r>
-        <w:rPr>
-          <w:rFonts w:ascii="Times New Roman" w:eastAsia="SimSun" w:hAnsi="Times New Roman"/>
-          <w:sz w:val="24"/>
-          <w:szCs w:val="24"/>
-        </w:rPr>
-        <w:t xml:space="preserve">8. “增强”效果缺少基线比较和针对性消融。文章以ViscoelasticNet为主要比较对象，并宣称逐点缩放“优于传统全局方差缩放”，但未在相同数据和训练预算下给出直接比较。第2.5节的实验只围绕先验设置展开，没有对参数变换、稀疏正则化、动态调度、逐点缩放和梯度缩放各自的贡献做消融，与引言所述“四项消融实验系统评估了上述策略”不符。不同缩放方式下的损失值也不宜直接作为精度优劣的证据，应在统一测试集上用相同的场误差和物理残差指标比较。此外，所有结果均为单次运行，“24组鲁棒性实验无发散”也未列出具体配置，请报告多随机种子的均值、标准差和失败比例。</w:t>
+        <w:t xml:space="preserve">三、修改意见</w:t>
+      </w:r>
+    </w:p>
+    <w:p>
+      <w:pPr>
+        <w:spacing w:after="80" w:line="360"/>
+        <w:ind w:firstLine="480"/>
+      </w:pPr>
+      <w:r>
+        <w:rPr>
+          <w:rFonts w:ascii="Times New Roman" w:eastAsia="SimSun" w:hAnsi="Times New Roman"/>
+          <w:sz w:val="24"/>
+          <w:szCs w:val="24"/>
+        </w:rPr>
+        <w:t xml:space="preserve">1. 模型选择的表述与实验设计不完全相符。式(33)按模型类型分别设置稀疏惩罚，即需要压缩的参数已由预设的模型类别决定，因此现有结果更接近“给定模型假设下的参数稀疏化”，与摘要和结论中的“自动甄别”“全部正确识别”有差距。建议作者说明实际使用时是否需要预先指定模型类别：若不需要，请在隐藏模型标签的数据上，用统一的目标函数和判定准则进行验证；若需要，请相应调整题目、摘要和结论的表述。同时，参数被压缩到10⁻⁶量级并不等于严格为零，请说明“近零”与“非零”的具体判定规则。</w:t>
+      </w:r>
+    </w:p>
+    <w:p>
+      <w:pPr>
+        <w:spacing w:after="80" w:line="360"/>
+        <w:ind w:firstLine="480"/>
+      </w:pPr>
+      <w:r>
+        <w:rPr>
+          <w:rFonts w:ascii="Times New Roman" w:eastAsia="SimSun" w:hAnsi="Times New Roman"/>
+          <w:sz w:val="24"/>
+          <w:szCs w:val="24"/>
+        </w:rPr>
+        <w:t xml:space="preserve">2. 参数辨识效果的评价应更客观。按表1计算，三种模型的松弛时间λ相对误差分别约为289%、286%和400%，Giesekus模型的α相对误差约为19%，结论中“全部参数收敛至真值附近”的说法与表2中λ=0.42～0.56的结果不符。建议在摘要和结论中分别评价黏度、松弛时间和非线性参数的辨识情况，如实说明松弛时间目前未能准确恢复。</w:t>
+      </w:r>
+    </w:p>
+    <w:p>
+      <w:pPr>
+        <w:spacing w:after="80" w:line="360"/>
+        <w:ind w:firstLine="480"/>
+      </w:pPr>
+      <w:r>
+        <w:rPr>
+          <w:rFonts w:ascii="Times New Roman" w:eastAsia="SimSun" w:hAnsi="Times New Roman"/>
+          <w:sz w:val="24"/>
+          <w:szCs w:val="24"/>
+        </w:rPr>
+        <w:t xml:space="preserve">3. 需要进一步说明先验的作用。表1中ηp、ηs与真值在四位有效数字上一致，而第2.5节又表明先验偏离真值时黏度参数会锁定在先验值附近，因此黏度的小误差来自数据还是来自先验，尚难判断。建议列出各参数的先验均值、权重、取值依据和初始化方式，说明先验是否来自独立信息，并补充先验偏离真值、无先验以及多次重复训练的结果，以区分先验与数据各自的贡献。</w:t>
+      </w:r>
+    </w:p>
+    <w:p>
+      <w:pPr>
+        <w:spacing w:after="80" w:line="360"/>
+        <w:ind w:firstLine="480"/>
+      </w:pPr>
+      <w:r>
+        <w:rPr>
+          <w:rFonts w:ascii="Times New Roman" w:eastAsia="SimSun" w:hAnsi="Times New Roman"/>
+          <w:sz w:val="24"/>
+          <w:szCs w:val="24"/>
+        </w:rPr>
+        <w:t xml:space="preserve">4. 关于松弛时间偏高的解释需要补充依据。式(41)直接给出∂L/∂λ&lt;0在λ∈[0.1,2.0]内成立，但文中没有给出推导或数值验证；按式(20)，T1展开后的第二项并不显含λ，分母S又依赖F，单调性并不显然。同时请说明实现中是否对S停止梯度。建议通过固定网络后的参数扫描、损失剖面或时间步长敏感性等方式加以检验。此外，训练方案未能恢复参数不等同于参数在理论上不可辨识，摘要中“理论可辨识性边界”的说法建议改为对当前设置下观察到的现象的描述。</w:t>
+      </w:r>
+    </w:p>
+    <w:p>
+      <w:pPr>
+        <w:spacing w:after="80" w:line="360"/>
+        <w:ind w:firstLine="480"/>
+      </w:pPr>
+      <w:r>
+        <w:rPr>
+          <w:rFonts w:ascii="Times New Roman" w:eastAsia="SimSun" w:hAnsi="Times New Roman"/>
+          <w:sz w:val="24"/>
+          <w:szCs w:val="24"/>
+        </w:rPr>
+        <w:t xml:space="preserve">5. 方程与时间递推部分的描述需要统一。第1.1节称“在稳态框架下忽略时间导数”，而算例是瞬态的，一致性损失本身就是对∂τ/∂t的离散，请明确式(19)中F的含义，给出由瞬态本构方程到式(18)的推导，并说明采用标准化时间步长后时间导数与空间导数的尺度如何保持一致。摘要中“以时间递推替代高阶空间导数”的说法也不准确，因为本构方程只含一阶空间导数，被替换的是时间导数。另外，文中列出了不可压缩条件，但损失函数中未见连续性方程残差，请补充说明其实现方式。</w:t>
+      </w:r>
+    </w:p>
+    <w:p>
+      <w:pPr>
+        <w:spacing w:after="80" w:line="360"/>
+        <w:ind w:firstLine="480"/>
+      </w:pPr>
+      <w:r>
+        <w:rPr>
+          <w:rFonts w:ascii="Times New Roman" w:eastAsia="SimSun" w:hAnsi="Times New Roman"/>
+          <w:sz w:val="24"/>
+          <w:szCs w:val="24"/>
+        </w:rPr>
+        <w:t xml:space="preserve">6. 训练所用信息与“仅依赖稀疏速度观测”的表述不完全一致。损失中使用了应力初值、壁面及进出口应力参考值、压力参考值，并用全场数据预计算标准差，数据也为稠密无噪声的数值解。建议作者明确哪些信息属于实际观测、已知初边值条件、先验信息和仅用于验证的参考解，说明应力边界值和标准差的来源，并解释封闭方腔中inlet、outlet和压力出口条件的含义。在补充噪声和采样密度变化的验证之前，建议将“可与粒子图像测速直接衔接”改为潜在应用方向。</w:t>
+      </w:r>
+    </w:p>
+    <w:p>
+      <w:pPr>
+        <w:spacing w:after="80" w:line="360"/>
+        <w:ind w:firstLine="480"/>
+      </w:pPr>
+      <w:r>
+        <w:rPr>
+          <w:rFonts w:ascii="Times New Roman" w:eastAsia="SimSun" w:hAnsi="Times New Roman"/>
+          <w:sz w:val="24"/>
+          <w:szCs w:val="24"/>
+        </w:rPr>
+        <w:t xml:space="preserve">7. 数据设置与验证方案需要完善。第2.1节中总时长0.03 s、输出间隔0.01 s与16个快照不能同时成立；摘要中的“约6500个采样点”与第2.2节的1.29×10⁵个点不一致，请分别给出观测点、配置点、初边值点和测试点的数量及采样方式。以t=0快照作为测试集意义不大（该时刻全场为零且已用于初始条件约束），建议在未参与训练的非零时刻或位置进行验证。第2.4节题为“场量预测对比”，但只给出了损失曲线，建议补充速度、应力、压力的参考场、预测场、误差场及相对L2误差。</w:t>
+      </w:r>
+    </w:p>
+    <w:p>
+      <w:pPr>
+        <w:spacing w:after="80" w:line="360"/>
+        <w:ind w:firstLine="480"/>
+      </w:pPr>
+      <w:r>
+        <w:rPr>
+          <w:rFonts w:ascii="Times New Roman" w:eastAsia="SimSun" w:hAnsi="Times New Roman"/>
+          <w:sz w:val="24"/>
+          <w:szCs w:val="24"/>
+        </w:rPr>
+        <w:t xml:space="preserve">8. 动态损失权重的说明与公式不符。式(36)(37)中数据损失与一致性损失乘以同一个系数，二者的相对权重并不随训练进度改变，与“训练初期数据项主导、后期物理约束充分激活”的解释不一致；初始条件权重在训练初期也并未被降低。建议核对公式与代码，准确说明该调度改变了哪些项之间的关系，并给出各项损失随训练进度变化的曲线。</w:t>
+      </w:r>
+    </w:p>
+    <w:p>
+      <w:pPr>
+        <w:spacing w:after="80" w:line="360"/>
+        <w:ind w:firstLine="480"/>
+      </w:pPr>
+      <w:r>
+        <w:rPr>
+          <w:rFonts w:ascii="Times New Roman" w:eastAsia="SimSun" w:hAnsi="Times New Roman"/>
+          <w:sz w:val="24"/>
+          <w:szCs w:val="24"/>
+        </w:rPr>
+        <w:t xml:space="preserve">9. “增强”效果需要对比实验支持。文章以ViscoelasticNet为主要比较对象，但未在相同数据和训练预算下给出直接对比；第2.5节的实验主要围绕先验展开，未分别检验参数变换、稀疏正则化、动态调度和逐点缩放各自的作用，“优于全局方差缩放”的结论缺少定量支撑。建议补充基线对比和针对性消融，在统一测试集上使用相同指标评价，并报告多次独立训练的结果（“24组鲁棒性实验”也请列出具体配置）。</w:t>
+      </w:r>
+    </w:p>
+    <w:p>
+      <w:pPr>
+        <w:spacing w:after="80" w:line="360"/>
+        <w:ind w:firstLine="480"/>
+      </w:pPr>
+      <w:r>
+        <w:rPr>
+          <w:rFonts w:ascii="Times New Roman" w:eastAsia="SimSun" w:hAnsi="Times New Roman"/>
+          <w:sz w:val="24"/>
+          <w:szCs w:val="24"/>
+        </w:rPr>
+        <w:t xml:space="preserve">10. 文中若干数值与表述前后不一致，请统一核对：(1)第2.2节称黏度最大偏差不超过4%，但表2中Giesekus的ηp为0.0141、0.0151、0.0123（真值0.01），PTT在γλ=10⁻³时ηp=0.0125；(2)第2.5节称α误差为16%，与表1（约19%）和表2（约4%～8%）均不符；(3)γλ=10⁻³时ε=0.0797，偏离约20%而非23%；(4)“式(21)的力平衡机制”应为式(42)；(5)第1.4.3节所称“第3节的配置”实为结论章，各损失权重未给出；(6)表1未说明对应的γλ，Giesekus、PTT的λ真值也与正文不一致。</w:t>
+      </w:r>
+    </w:p>
+    <w:p>
+      <w:pPr>
+        <w:spacing w:after="80" w:line="360"/>
+        <w:ind w:firstLine="480"/>
+      </w:pPr>
+      <w:r>
+        <w:rPr>
+          <w:rFonts w:ascii="Times New Roman" w:eastAsia="SimSun" w:hAnsi="Times New Roman"/>
+          <w:sz w:val="24"/>
+          <w:szCs w:val="24"/>
+        </w:rPr>
+        <w:t xml:space="preserve">11. 其他说明：(1)softplus只能渐近趋零，exp与softplus均无上界，“严格归零”“保证有界性”的表述应与实际裁剪操作区分；“正定性”一词适用于矩阵，标量参数宜称“正性”；请给出各参数的裁剪区间及依据。(2)式(26)计算的是均方根，并非标准差。(3)非有限导数置零、F裁剪等数值处理可能改变实际被优化的残差，请报告其触发频率。(4)请补充迭代次数、优化器、批量大小、学习率、各损失权重、先验均值和GPU型号等复现信息。(5)英文摘要中的“ViscoelasticNet++”未见于中文摘要和正文，请统一；“黏/粘”等术语也请统一。</w:t>
       </w:r>
     </w:p>
     <w:p>
@@ -334,118 +376,21 @@
           <w:sz w:val="26"/>
           <w:szCs w:val="26"/>
         </w:rPr>
-        <w:t xml:space="preserve">四、其他修改意见</w:t>
-      </w:r>
-    </w:p>
-    <w:p>
-      <w:pPr>
-        <w:spacing w:after="60" w:line="360"/>
-        <w:ind w:firstLine="480"/>
-      </w:pPr>
-      <w:r>
-        <w:rPr>
-          <w:rFonts w:ascii="Times New Roman" w:eastAsia="SimSun" w:hAnsi="Times New Roman"/>
-          <w:sz w:val="24"/>
-          <w:szCs w:val="24"/>
-        </w:rPr>
-        <w:t xml:space="preserve">1. 数值与表格前后不一致，请逐项核对：(1)第2.2节称黏度参数最大偏差不超过4%，但表2中Giesekus的ηp为0.0141、0.0151、0.0123（真值0.01，偏差23%～51%），PTT在γλ=10⁻³时ηp=0.0125（偏差25%）；(2)第2.5节称α误差16%，但表1为19.3%，表2各行为4%～8%；(3)称γλ=10⁻³时ε偏离23%，按0.0797计算约为20.3%；(4)“证实了式(21)的力平衡机制”应为式(42)；(5)第1.4.3节“第3节的配置”实为结论章，未给出各项权重；(6)表1未说明对应哪个γλ，其λ、α在表2中无对应行，且Giesekus、PTT的λ真值以“–”省略，与正文λ=0.1不一致。</w:t>
-      </w:r>
-    </w:p>
-    <w:p>
-      <w:pPr>
-        <w:spacing w:after="60" w:line="360"/>
-        <w:ind w:firstLine="480"/>
-      </w:pPr>
-      <w:r>
-        <w:rPr>
-          <w:rFonts w:ascii="Times New Roman" w:eastAsia="SimSun" w:hAnsi="Times New Roman"/>
-          <w:sz w:val="24"/>
-          <w:szCs w:val="24"/>
-        </w:rPr>
-        <w:t xml:space="preserve">2. 参数约束的表述需更准确。softplus在有限输入下严格大于零，只能渐近趋零；exp与softplus均无上界，引言所称“保证有界性”与实际的裁剪操作应区分。“正定性”一词适用于矩阵，标量参数应称为正性或非负性。请列出各参数的裁剪区间及取值依据，例如λ的下界0.1恰等于其真值，需说明原因。</w:t>
-      </w:r>
-    </w:p>
-    <w:p>
-      <w:pPr>
-        <w:spacing w:after="60" w:line="360"/>
-        <w:ind w:firstLine="480"/>
-      </w:pPr>
-      <w:r>
-        <w:rPr>
-          <w:rFonts w:ascii="Times New Roman" w:eastAsia="SimSun" w:hAnsi="Times New Roman"/>
-          <w:sz w:val="24"/>
-          <w:szCs w:val="24"/>
-        </w:rPr>
-        <w:t xml:space="preserve">3. 式(26)计算的是惯性项幅值的均方根，并非减去均值的标准差，请统一名称；式(6)与式(12)(13)重复。</w:t>
-      </w:r>
-    </w:p>
-    <w:p>
-      <w:pPr>
-        <w:spacing w:after="60" w:line="360"/>
-        <w:ind w:firstLine="480"/>
-      </w:pPr>
-      <w:r>
-        <w:rPr>
-          <w:rFonts w:ascii="Times New Roman" w:eastAsia="SimSun" w:hAnsi="Times New Roman"/>
-          <w:sz w:val="24"/>
-          <w:szCs w:val="24"/>
-        </w:rPr>
-        <w:t xml:space="preserve">4. 非有限导数置零、F裁剪至±10⁶、全局梯度裁剪以及式(9)的参数特异梯度缩放，都可能改变实际被优化的残差。请报告这些机制的触发频率（尤其训练后期），并给出未经这些处理的独立残差检查。</w:t>
-      </w:r>
-    </w:p>
-    <w:p>
-      <w:pPr>
-        <w:spacing w:after="60" w:line="360"/>
-        <w:ind w:firstLine="480"/>
-      </w:pPr>
-      <w:r>
-        <w:rPr>
-          <w:rFonts w:ascii="Times New Roman" w:eastAsia="SimSun" w:hAnsi="Times New Roman"/>
-          <w:sz w:val="24"/>
-          <w:szCs w:val="24"/>
-        </w:rPr>
-        <w:t xml:space="preserve">5. 请补充可复现信息：两阶段迭代次数、优化器、批量大小、学习率、全部损失权重、先验均值、随机种子、GPU型号，以及“不足1小时”对应的迭代数。</w:t>
-      </w:r>
-    </w:p>
-    <w:p>
-      <w:pPr>
-        <w:spacing w:after="60" w:line="360"/>
-        <w:ind w:firstLine="480"/>
-      </w:pPr>
-      <w:r>
-        <w:rPr>
-          <w:rFonts w:ascii="Times New Roman" w:eastAsia="SimSun" w:hAnsi="Times New Roman"/>
-          <w:sz w:val="24"/>
-          <w:szCs w:val="24"/>
-        </w:rPr>
-        <w:t xml:space="preserve">6. 英文摘要中的“ViscoelasticNet++”未见于中文摘要和正文，请统一，并说明其与ViscoelasticNet的关系；“黏/粘”“伸长/伸展性”等术语请统一。</w:t>
-      </w:r>
-    </w:p>
-    <w:p>
-      <w:pPr>
-        <w:spacing w:after="100" w:before="240"/>
-      </w:pPr>
-      <w:r>
-        <w:rPr>
-          <w:rFonts w:ascii="Times New Roman" w:eastAsia="SimHei" w:hAnsi="Times New Roman"/>
-          <w:sz w:val="26"/>
-          <w:szCs w:val="26"/>
-        </w:rPr>
-        <w:t xml:space="preserve">五、审稿结论</w:t>
-      </w:r>
-    </w:p>
-    <w:p>
-      <w:pPr>
-        <w:spacing w:after="60" w:line="360"/>
-        <w:ind w:firstLine="480"/>
-      </w:pPr>
-      <w:r>
-        <w:rPr>
-          <w:rFonts w:ascii="Times New Roman" w:eastAsia="SimSun" w:hAnsi="Times New Roman"/>
-          <w:sz w:val="24"/>
-          <w:szCs w:val="24"/>
-        </w:rPr>
-        <w:t xml:space="preserve">本文研究的问题有意义，方法组合具有一定工程价值，但目前的实验尚不能支撑“自动模型甄别”“高精度参数辨识”“理论可辨识性边界”以及“可直接对接实验”等核心结论。需要优先回答三个问题：模型类别是否真正由未知数据识别；参数估计是否有独立于正确先验的数据证据；松弛时间的偏差是否经过与实际实现一致的分析。上述问题涉及方法与结论的有效性，不能仅靠文字修改解决。建议作者完成方法核验、补充关键对照实验并相应收缩结论后，提交修改稿重审。</w:t>
+        <w:t xml:space="preserve">四、审稿结论</w:t>
+      </w:r>
+    </w:p>
+    <w:p>
+      <w:pPr>
+        <w:spacing w:after="80" w:line="360"/>
+        <w:ind w:firstLine="480"/>
+      </w:pPr>
+      <w:r>
+        <w:rPr>
+          <w:rFonts w:ascii="Times New Roman" w:eastAsia="SimSun" w:hAnsi="Times New Roman"/>
+          <w:sz w:val="24"/>
+          <w:szCs w:val="24"/>
+        </w:rPr>
+        <w:t xml:space="preserve">本文研究的问题有意义，方法具有一定工程价值，但现有实验尚不足以支撑“自动模型甄别”和“可靠参数辨识”的结论。建议作者重点回应三个方面：模型类别是否真正由数据识别；参数估计是否有独立于先验的数据依据；松弛时间偏差的解释是否与实际实现一致。在补充必要的对照实验、统一方程与数据的描述并适当调整结论后，可提交修改稿再审。</w:t>
       </w:r>
     </w:p>
     <w:sectPr>

</xml_diff>

<commit_message>
Refine review comments: tighten claims and scope
Co-Authored-By: Claude Sonnet 5.5 <noreply@anthropic.com>
Claude-Session: https://claude.ai/code/session_01W5KVGsn3NPSe2tZYET3Lj5
</commit_message>
<xml_diff>
--- a/审稿意见.docx
+++ b/审稿意见.docx
@@ -196,7 +196,7 @@
           <w:sz w:val="24"/>
           <w:szCs w:val="24"/>
         </w:rPr>
-        <w:t xml:space="preserve">该问题属于计算流变学中的反问题，具有较好的研究价值。文章在参数约束、损失量级平衡和训练稳定性方面做了较细致的工作，对先验缺失、偏离及权重敏感性的讨论也有参考意义。但就现有实验而言，“自动模型甄别”和“可靠的参数辨识”两项主要结论的证据还不够充分，部分方程表述、数据设置和数值引用也有不一致之处。建议作者针对以下问题修改。</w:t>
+        <w:t xml:space="preserve">本文研究基于速度观测与初边值条件的黏弹性流体本构模型及参数辨识问题，具有较好的研究价值。文章在参数约束、损失量级平衡和训练稳定性方面做了较细致的工作，对先验缺失、偏离及权重敏感性的讨论也有参考意义。但就现有实验而言，“自动模型甄别”和“可靠的参数辨识”两项主要结论的证据还不够充分，部分方程表述、数据设置和数值引用也有不一致之处。建议作者针对以下问题修改。</w:t>
       </w:r>
     </w:p>
     <w:p>
@@ -223,7 +223,7 @@
           <w:sz w:val="24"/>
           <w:szCs w:val="24"/>
         </w:rPr>
-        <w:t xml:space="preserve">1. 模型选择的表述与实验设计不完全相符。式(33)按模型类型分别设置稀疏惩罚，即需要压缩的参数已由预设的模型类别决定，因此现有结果更接近“给定模型假设下的参数稀疏化”，与摘要和结论中的“自动甄别”“全部正确识别”有差距。建议作者说明实际使用时是否需要预先指定模型类别：若不需要，请在隐藏模型标签的数据上，用统一的目标函数和判定准则进行验证；若需要，请相应调整题目、摘要和结论的表述。同时，参数被压缩到10⁻⁶量级并不等于严格为零，请说明“近零”与“非零”的具体判定规则。</w:t>
+        <w:t xml:space="preserve">1. 模型选择的表述与实验设计不完全相符。式(33)按模型类型分别设置稀疏惩罚，即需要压缩的参数已由预设的模型类别决定，第1.5.2节也使用了“给定模型假设下的参数识别能力”的限定，因此现有结果更接近“给定模型假设下的参数稀疏化”，与摘要、第2.3节和结论中的“自动甄别”“全部正确识别”有差距。建议作者说明实际使用时是否需要预先指定真实模型类别：若不需要，请给出未知类别条件下的完整辨识流程，并在不使用真实类别信息的情况下验证；若采用候选模型逐一拟合的方式，请说明各候选结果如何比较，以及最终选择所依据的预先设定准则；若需要预先指定，则应相应调整题目、摘要和结论的表述。同时，参数被压缩到10⁻⁶量级并不等于严格为零，请说明“近零”与“非零”的具体判定规则。</w:t>
       </w:r>
     </w:p>
     <w:p>
@@ -251,7 +251,7 @@
           <w:sz w:val="24"/>
           <w:szCs w:val="24"/>
         </w:rPr>
-        <w:t xml:space="preserve">3. 需要进一步说明先验的作用。表1中ηp、ηs与真值在四位有效数字上一致，而第2.5节又表明先验偏离真值时黏度参数会锁定在先验值附近，因此黏度的小误差来自数据还是来自先验，尚难判断。建议列出各参数的先验均值、权重、取值依据和初始化方式，说明先验是否来自独立信息，并补充先验偏离真值、无先验以及多次重复训练的结果，以区分先验与数据各自的贡献。</w:t>
+        <w:t xml:space="preserve">3. 需要进一步说明先验的作用。表1中部分黏度参数在所报告的小数精度下与真值完全一致，而第2.5节又表明，先验偏离真值时黏度参数会锁定在先验值附近，因此当前结果尚不能充分区分观测数据与先验约束各自的贡献。建议作者列出各参数的先验均值、权重、取值依据和初始化方式，说明先验是否来自独立信息；完整给出已有无先验及先验偏差实验的配置与定量结果，并补充多次独立训练的统计结果。</w:t>
       </w:r>
     </w:p>
     <w:p>
@@ -293,35 +293,35 @@
           <w:sz w:val="24"/>
           <w:szCs w:val="24"/>
         </w:rPr>
-        <w:t xml:space="preserve">6. 训练所用信息与“仅依赖稀疏速度观测”的表述不完全一致。损失中使用了应力初值、壁面及进出口应力参考值、压力参考值，并用全场数据预计算标准差，数据也为稠密无噪声的数值解。建议作者明确哪些信息属于实际观测、已知初边值条件、先验信息和仅用于验证的参考解，说明应力边界值和标准差的来源，并解释封闭方腔中inlet、outlet和压力出口条件的含义。在补充噪声和采样密度变化的验证之前，建议将“可与粒子图像测速直接衔接”改为潜在应用方向。</w:t>
-      </w:r>
-    </w:p>
-    <w:p>
-      <w:pPr>
-        <w:spacing w:after="80" w:line="360"/>
-        <w:ind w:firstLine="480"/>
-      </w:pPr>
-      <w:r>
-        <w:rPr>
-          <w:rFonts w:ascii="Times New Roman" w:eastAsia="SimSun" w:hAnsi="Times New Roman"/>
-          <w:sz w:val="24"/>
-          <w:szCs w:val="24"/>
-        </w:rPr>
-        <w:t xml:space="preserve">7. 数据设置与验证方案需要完善。第2.1节中总时长0.03 s、输出间隔0.01 s与16个快照不能同时成立；摘要中的“约6500个采样点”与第2.2节的1.29×10⁵个点不一致，请分别给出观测点、配置点、初边值点和测试点的数量及采样方式。以t=0快照作为测试集意义不大（该时刻全场为零且已用于初始条件约束），建议在未参与训练的非零时刻或位置进行验证。第2.4节题为“场量预测对比”，但只给出了损失曲线，建议补充速度、应力、压力的参考场、预测场、误差场及相对L2误差。</w:t>
-      </w:r>
-    </w:p>
-    <w:p>
-      <w:pPr>
-        <w:spacing w:after="80" w:line="360"/>
-        <w:ind w:firstLine="480"/>
-      </w:pPr>
-      <w:r>
-        <w:rPr>
-          <w:rFonts w:ascii="Times New Roman" w:eastAsia="SimSun" w:hAnsi="Times New Roman"/>
-          <w:sz w:val="24"/>
-          <w:szCs w:val="24"/>
-        </w:rPr>
-        <w:t xml:space="preserve">8. 动态损失权重的说明与公式不符。式(36)(37)中数据损失与一致性损失乘以同一个系数，二者的相对权重并不随训练进度改变，与“训练初期数据项主导、后期物理约束充分激活”的解释不一致；初始条件权重在训练初期也并未被降低。建议核对公式与代码，准确说明该调度改变了哪些项之间的关系，并给出各项损失随训练进度变化的曲线。</w:t>
+        <w:t xml:space="preserve">6. 训练中实际使用的信息条件尚不够清楚。除稀疏速度观测外，损失函数还涉及应力初边值、压力参考值，以及应力和压力的归一化统计量。建议作者区分可独立给定的物理条件与从参考解中提取的辅助信息，明确应力边界值是否取自参考解、标准差是否由全场参考数据计算，并说明其使用范围；同时请解释封闭方腔中inlet、outlet和压力出口条件分别对应哪些区域。在补充观测噪声和采样密度变化的验证之前，建议将“可与粒子图像测速直接衔接”改为潜在应用方向。</w:t>
+      </w:r>
+    </w:p>
+    <w:p>
+      <w:pPr>
+        <w:spacing w:after="80" w:line="360"/>
+        <w:ind w:firstLine="480"/>
+      </w:pPr>
+      <w:r>
+        <w:rPr>
+          <w:rFonts w:ascii="Times New Roman" w:eastAsia="SimSun" w:hAnsi="Times New Roman"/>
+          <w:sz w:val="24"/>
+          <w:szCs w:val="24"/>
+        </w:rPr>
+        <w:t xml:space="preserve">7. 数据设置与验证方案需要完善。第2.1节中总时长0.03 s、输出间隔0.01 s与16个快照按等间隔理解不能同时成立，请列出实际输出时刻。摘要中的“约6500个采样点”与第2.2节的1.29×10⁵个时空点之间的对应关系尚未说明，请明确两者是否分别指抽样观测点和全量参考数据，并分别报告观测点、配置点、初边值点和测试点的数量及采样方式。t=0为已知的零初始状态，且至少应力初值同时用于训练约束，因此以该快照作测试集不足以评价非平凡流场的重建能力，请说明测试变量与初值约束是否重叠，并在未参与训练的非零时刻或空间位置进行验证。第2.4节题为“场量预测对比”，但只给出了损失曲线，建议补充速度、应力、压力的参考场、预测场、误差场及相对L2误差。</w:t>
+      </w:r>
+    </w:p>
+    <w:p>
+      <w:pPr>
+        <w:spacing w:after="80" w:line="360"/>
+        <w:ind w:firstLine="480"/>
+      </w:pPr>
+      <w:r>
+        <w:rPr>
+          <w:rFonts w:ascii="Times New Roman" w:eastAsia="SimSun" w:hAnsi="Times New Roman"/>
+          <w:sz w:val="24"/>
+          <w:szCs w:val="24"/>
+        </w:rPr>
+        <w:t xml:space="preserve">8. 动态损失权重的解释与公式不完全对应。式(36)(37)中数据损失与一致性损失乘以同一个系数，二者的预设相对权重并不随训练进度改变，因此不能仅凭这两式推出“训练初期数据项主导、后期物理约束充分激活”的机制解释。建议结合各项加权损失以及梯度贡献随训练进度的变化，说明实际训练中各项的主导关系如何变化；初始条件权重在训练初期并未被降低而是随后衰减，也请一并核对。</w:t>
       </w:r>
     </w:p>
     <w:p>
@@ -349,7 +349,7 @@
           <w:sz w:val="24"/>
           <w:szCs w:val="24"/>
         </w:rPr>
-        <w:t xml:space="preserve">10. 文中若干数值与表述前后不一致，请统一核对：(1)第2.2节称黏度最大偏差不超过4%，但表2中Giesekus的ηp为0.0141、0.0151、0.0123（真值0.01），PTT在γλ=10⁻³时ηp=0.0125；(2)第2.5节称α误差为16%，与表1（约19%）和表2（约4%～8%）均不符；(3)γλ=10⁻³时ε=0.0797，偏离约20%而非23%；(4)“式(21)的力平衡机制”应为式(42)；(5)第1.4.3节所称“第3节的配置”实为结论章，各损失权重未给出；(6)表1未说明对应的γλ，Giesekus、PTT的λ真值也与正文不一致。</w:t>
+        <w:t xml:space="preserve">10. 文中若干数值与表述需要统一核对：(1)第2.2节“黏度最大偏差不超过4%”对应表1的基准配置（PTT的ηp为0.0096，偏差4%）时可以成立，但表2的先验权重实验中部分黏度误差明显更大（如Giesekus的ηp为0.0123～0.0151，真值0.01），请说明表1所对应的完整训练与先验配置，并区分基准配置下的辨识精度与不同先验设置下的鲁棒性，避免把前者推广为普遍结论；(2)第2.5节的百分比与表格不符，例如称γλ=10⁻⁵时ε误差为3%、α误差为16%，而表2对应结果分别约为0.7%和6.6%，另称γλ=10⁻³时ε偏离23%，按0.0797计算约为20.3%，请明确各百分比对应的实验组；(3)“式(21)的力平衡机制”应为式(42)；(4)第1.4.3节所称“第3节的配置”指向结论章，请核对交叉引用，文中虽给出了部分损失权重，但第二阶段等配置仍不完整，建议集中提供完整超参数表；(5)表1未说明对应的γλ及其他先验配置，Giesekus和PTT的松弛时间真值以横线表示，而正文明确为0.1，请补齐并说明横线的含义。</w:t>
       </w:r>
     </w:p>
     <w:p>

</xml_diff>

<commit_message>
Finalize review comments wording
Co-Authored-By: Claude Sonnet 5.5 <noreply@anthropic.com>
Claude-Session: https://claude.ai/code/session_01W5KVGsn3NPSe2tZYET3Lj5
</commit_message>
<xml_diff>
--- a/审稿意见.docx
+++ b/审稿意见.docx
@@ -251,21 +251,21 @@
           <w:sz w:val="24"/>
           <w:szCs w:val="24"/>
         </w:rPr>
-        <w:t xml:space="preserve">3. 需要进一步说明先验的作用。表1中部分黏度参数在所报告的小数精度下与真值完全一致，而第2.5节又表明，先验偏离真值时黏度参数会锁定在先验值附近，因此当前结果尚不能充分区分观测数据与先验约束各自的贡献。建议作者列出各参数的先验均值、权重、取值依据和初始化方式，说明先验是否来自独立信息；完整给出已有无先验及先验偏差实验的配置与定量结果，并补充多次独立训练的统计结果。</w:t>
-      </w:r>
-    </w:p>
-    <w:p>
-      <w:pPr>
-        <w:spacing w:after="80" w:line="360"/>
-        <w:ind w:firstLine="480"/>
-      </w:pPr>
-      <w:r>
-        <w:rPr>
-          <w:rFonts w:ascii="Times New Roman" w:eastAsia="SimSun" w:hAnsi="Times New Roman"/>
-          <w:sz w:val="24"/>
-          <w:szCs w:val="24"/>
-        </w:rPr>
-        <w:t xml:space="preserve">4. 关于松弛时间偏高的解释需要补充依据。式(41)直接给出∂L/∂λ&lt;0在λ∈[0.1,2.0]内成立，但文中没有给出推导或数值验证；按式(20)，T1展开后的第二项并不显含λ，分母S又依赖F，单调性并不显然。同时请说明实现中是否对S停止梯度。建议通过固定网络后的参数扫描、损失剖面或时间步长敏感性等方式加以检验。此外，训练方案未能恢复参数不等同于参数在理论上不可辨识，摘要中“理论可辨识性边界”的说法建议改为对当前设置下观察到的现象的描述。</w:t>
+        <w:t xml:space="preserve">3. 需要进一步说明先验的作用。表1中部分黏度参数在所报告的小数精度下与真值完全一致，而第2.5节又表明，先验偏离真值时部分黏度参数会锁定在先验值附近，因此当前结果尚不能充分区分观测数据与先验约束各自的贡献。建议作者列出各参数的先验均值、权重、取值依据和初始化方式，说明先验是否来自独立信息；完整给出已有无先验及先验偏差实验的配置与定量结果，并补充多次独立训练的统计结果。</w:t>
+      </w:r>
+    </w:p>
+    <w:p>
+      <w:pPr>
+        <w:spacing w:after="80" w:line="360"/>
+        <w:ind w:firstLine="480"/>
+      </w:pPr>
+      <w:r>
+        <w:rPr>
+          <w:rFonts w:ascii="Times New Roman" w:eastAsia="SimSun" w:hAnsi="Times New Roman"/>
+          <w:sz w:val="24"/>
+          <w:szCs w:val="24"/>
+        </w:rPr>
+        <w:t xml:space="preserve">4. 关于松弛时间偏高的解释需要补充依据。式(41)直接给出∂L_consistency/∂λ&lt;0在λ∈[0.1,2.0]内成立，但文中没有给出推导或数值验证；按式(20)，T1展开后的第二项并不显含λ，分母S又依赖F，单调性并不显然。同时请说明实现中是否对S停止梯度。建议通过固定网络后的参数扫描、损失剖面或时间步长敏感性等方式加以检验。此外，训练方案未能恢复参数不等同于参数在理论上不可辨识，英文摘要中“理论可辨识性边界”的说法建议改为对当前设置下观察到的现象的描述。</w:t>
       </w:r>
     </w:p>
     <w:p>
@@ -349,21 +349,21 @@
           <w:sz w:val="24"/>
           <w:szCs w:val="24"/>
         </w:rPr>
-        <w:t xml:space="preserve">10. 文中若干数值与表述需要统一核对：(1)第2.2节“黏度最大偏差不超过4%”对应表1的基准配置（PTT的ηp为0.0096，偏差4%）时可以成立，但表2的先验权重实验中部分黏度误差明显更大（如Giesekus的ηp为0.0123～0.0151，真值0.01），请说明表1所对应的完整训练与先验配置，并区分基准配置下的辨识精度与不同先验设置下的鲁棒性，避免把前者推广为普遍结论；(2)第2.5节的百分比与表格不符，例如称γλ=10⁻⁵时ε误差为3%、α误差为16%，而表2对应结果分别约为0.7%和6.6%，另称γλ=10⁻³时ε偏离23%，按0.0797计算约为20.3%，请明确各百分比对应的实验组；(3)“式(21)的力平衡机制”应为式(42)；(4)第1.4.3节所称“第3节的配置”指向结论章，请核对交叉引用，文中虽给出了部分损失权重，但第二阶段等配置仍不完整，建议集中提供完整超参数表；(5)表1未说明对应的γλ及其他先验配置，Giesekus和PTT的松弛时间真值以横线表示，而正文明确为0.1，请补齐并说明横线的含义。</w:t>
-      </w:r>
-    </w:p>
-    <w:p>
-      <w:pPr>
-        <w:spacing w:after="80" w:line="360"/>
-        <w:ind w:firstLine="480"/>
-      </w:pPr>
-      <w:r>
-        <w:rPr>
-          <w:rFonts w:ascii="Times New Roman" w:eastAsia="SimSun" w:hAnsi="Times New Roman"/>
-          <w:sz w:val="24"/>
-          <w:szCs w:val="24"/>
-        </w:rPr>
-        <w:t xml:space="preserve">11. 其他说明：(1)softplus只能渐近趋零，exp与softplus均无上界，“严格归零”“保证有界性”的表述应与实际裁剪操作区分；“正定性”一词适用于矩阵，标量参数宜称“正性”；请给出各参数的裁剪区间及依据。(2)式(26)计算的是均方根，并非标准差。(3)非有限导数置零、F裁剪等数值处理可能改变实际被优化的残差，请报告其触发频率。(4)请补充迭代次数、优化器、批量大小、学习率、各损失权重、先验均值和GPU型号等复现信息。(5)英文摘要中的“ViscoelasticNet++”未见于中文摘要和正文，请统一；“黏/粘”等术语也请统一。</w:t>
+        <w:t xml:space="preserve">10. 文中若干数值与表述需要统一核对：(1)第2.2节“黏度最大偏差不超过4%”应明确限定于表1的基准配置。表2中不同先验权重下的部分黏度误差明显增大（如Giesekus的ηp为0.0123～0.0151，真值0.01），请区分基准配置下的辨识精度与先验变化下的鲁棒性，避免将前者推广为普遍结论；(2)第2.5节的百分比与表格不符，例如称γλ=10⁻⁵时ε误差为3%、α误差为16%，而表2对应结果分别约为0.7%和6.6%，另称γλ=10⁻³时ε偏离23%，按0.0797计算约为20.3%，请明确各百分比对应的实验组；(3)“式(21)的力平衡机制”应为式(42)；(4)第1.4.3节所称“第3节的配置”指向结论章，请核对交叉引用，文中虽给出了部分损失权重，但第二阶段等配置仍不完整，建议集中提供完整超参数表；(5)表1未说明对应的γλ及其他先验配置，Giesekus和PTT的松弛时间真值以横线表示，而正文明确为0.1，请补齐并说明横线的含义。</w:t>
+      </w:r>
+    </w:p>
+    <w:p>
+      <w:pPr>
+        <w:spacing w:after="80" w:line="360"/>
+        <w:ind w:firstLine="480"/>
+      </w:pPr>
+      <w:r>
+        <w:rPr>
+          <w:rFonts w:ascii="Times New Roman" w:eastAsia="SimSun" w:hAnsi="Times New Roman"/>
+          <w:sz w:val="24"/>
+          <w:szCs w:val="24"/>
+        </w:rPr>
+        <w:t xml:space="preserve">11. 方法实现、复现信息及术语表述还需补充或规范：(1)softplus在有限输入下严格大于零，只能渐近趋零；exp与softplus本身均不提供上界。请将“归零”“保证有界性”等表述与实际的数值判定及裁剪操作区分。对于本文讨论的标量参数约束，建议使用“正性”或“非负性”等准确术语，并给出各参数的裁剪区间及依据。(2)式(26)计算的是均方根，并非标准差。(3)非有限导数置零、F裁剪等数值处理可能改变实际被优化的残差，请报告其触发频率。(4)请补充迭代次数、优化器、批量大小、学习率、各损失权重、先验均值和GPU型号等复现信息。(5)英文摘要中的“ViscoelasticNet++”未见于中文摘要和正文，请统一；“黏/粘”等术语也请统一。</w:t>
       </w:r>
     </w:p>
     <w:p>
@@ -390,7 +390,7 @@
           <w:sz w:val="24"/>
           <w:szCs w:val="24"/>
         </w:rPr>
-        <w:t xml:space="preserve">本文研究的问题有意义，方法具有一定工程价值，但现有实验尚不足以支撑“自动模型甄别”和“可靠参数辨识”的结论。建议作者重点回应三个方面：模型类别是否真正由数据识别；参数估计是否有独立于先验的数据依据；松弛时间偏差的解释是否与实际实现一致。在补充必要的对照实验、统一方程与数据的描述并适当调整结论后，可提交修改稿再审。</w:t>
+        <w:t xml:space="preserve">本文选题具有研究价值，但现有结果对模型自动甄别和参数可靠辨识的支持仍不充分。建议作者澄清模型选择流程与训练信息条件，补充关键对照和验证结果，并核对方程、实现及数据设置后，提交修改稿重审。</w:t>
       </w:r>
     </w:p>
     <w:sectPr>

</xml_diff>

<commit_message>
Reword review comments in a plainer reviewer voice
Co-Authored-By: Claude Sonnet 5.5 <noreply@anthropic.com>
Claude-Session: https://claude.ai/code/session_01W5KVGsn3NPSe2tZYET3Lj5
</commit_message>
<xml_diff>
--- a/审稿意见.docx
+++ b/审稿意见.docx
@@ -169,7 +169,7 @@
           <w:sz w:val="24"/>
           <w:szCs w:val="24"/>
         </w:rPr>
-        <w:t xml:space="preserve">本文针对黏弹性流体本构模型选择与参数辨识问题，在统一本构方程下（Oldroyd-B、Giesekus、线性PTT）提出了一种增强型物理信息神经网络框架，主要包括参数正性变换、对数–高斯先验、动态稀疏正则化、动态损失权重调度，以及逐点自适应缩放的本构一致性损失。作者以二维瞬态顶盖驱动方腔流为算例，报告三类模型均被正确识别，并讨论了先验对参数收敛的影响。</w:t>
+        <w:t xml:space="preserve">本文在统一本构方程下（Oldroyd-B、Giesekus、线性PTT），用物理信息神经网络从速度场反演本构参数并判别模型类型。作者对参数做了指数/softplus变换，加入对数–高斯先验和稀疏正则，损失权重随训练进度调整，并提出了按点缩放的、基于时间递推的本构一致性损失。算例为二维瞬态顶盖驱动方腔流，文中称三类模型均被正确识别，并分析了先验对收敛的影响。</w:t>
       </w:r>
     </w:p>
     <w:p>
@@ -196,7 +196,7 @@
           <w:sz w:val="24"/>
           <w:szCs w:val="24"/>
         </w:rPr>
-        <w:t xml:space="preserve">本文研究基于速度观测与初边值条件的黏弹性流体本构模型及参数辨识问题，具有较好的研究价值。文章在参数约束、损失量级平衡和训练稳定性方面做了较细致的工作，对先验缺失、偏离及权重敏感性的讨论也有参考意义。但就现有实验而言，“自动模型甄别”和“可靠的参数辨识”两项主要结论的证据还不够充分，部分方程表述、数据设置和数值引用也有不一致之处。建议作者针对以下问题修改。</w:t>
+        <w:t xml:space="preserve">这个问题有研究意义，文章在参数约束和训练稳定性上下了不少功夫，先验敏感性的分析也有参考价值。但目前的结果还撑不起摘要中“自动甄别模型”和“可靠辨识参数”的结论，另外方程描述、数据设置和部分数字前后对不上。具体意见如下。</w:t>
       </w:r>
     </w:p>
     <w:p>
@@ -223,147 +223,147 @@
           <w:sz w:val="24"/>
           <w:szCs w:val="24"/>
         </w:rPr>
-        <w:t xml:space="preserve">1. 模型选择的表述与实验设计不完全相符。式(33)按模型类型分别设置稀疏惩罚，即需要压缩的参数已由预设的模型类别决定，第1.5.2节也使用了“给定模型假设下的参数识别能力”的限定，因此现有结果更接近“给定模型假设下的参数稀疏化”，与摘要、第2.3节和结论中的“自动甄别”“全部正确识别”有差距。建议作者说明实际使用时是否需要预先指定真实模型类别：若不需要，请给出未知类别条件下的完整辨识流程，并在不使用真实类别信息的情况下验证；若采用候选模型逐一拟合的方式，请说明各候选结果如何比较，以及最终选择所依据的预先设定准则；若需要预先指定，则应相应调整题目、摘要和结论的表述。同时，参数被压缩到10⁻⁶量级并不等于严格为零，请说明“近零”与“非零”的具体判定规则。</w:t>
-      </w:r>
-    </w:p>
-    <w:p>
-      <w:pPr>
-        <w:spacing w:after="80" w:line="360"/>
-        <w:ind w:firstLine="480"/>
-      </w:pPr>
-      <w:r>
-        <w:rPr>
-          <w:rFonts w:ascii="Times New Roman" w:eastAsia="SimSun" w:hAnsi="Times New Roman"/>
-          <w:sz w:val="24"/>
-          <w:szCs w:val="24"/>
-        </w:rPr>
-        <w:t xml:space="preserve">2. 参数辨识效果的评价应更客观。按表1计算，三种模型的松弛时间λ相对误差分别约为289%、286%和400%，Giesekus模型的α相对误差约为19%，结论中“全部参数收敛至真值附近”的说法与表2中λ=0.42～0.56的结果不符。建议在摘要和结论中分别评价黏度、松弛时间和非线性参数的辨识情况，如实说明松弛时间目前未能准确恢复。</w:t>
-      </w:r>
-    </w:p>
-    <w:p>
-      <w:pPr>
-        <w:spacing w:after="80" w:line="360"/>
-        <w:ind w:firstLine="480"/>
-      </w:pPr>
-      <w:r>
-        <w:rPr>
-          <w:rFonts w:ascii="Times New Roman" w:eastAsia="SimSun" w:hAnsi="Times New Roman"/>
-          <w:sz w:val="24"/>
-          <w:szCs w:val="24"/>
-        </w:rPr>
-        <w:t xml:space="preserve">3. 需要进一步说明先验的作用。表1中部分黏度参数在所报告的小数精度下与真值完全一致，而第2.5节又表明，先验偏离真值时部分黏度参数会锁定在先验值附近，因此当前结果尚不能充分区分观测数据与先验约束各自的贡献。建议作者列出各参数的先验均值、权重、取值依据和初始化方式，说明先验是否来自独立信息；完整给出已有无先验及先验偏差实验的配置与定量结果，并补充多次独立训练的统计结果。</w:t>
-      </w:r>
-    </w:p>
-    <w:p>
-      <w:pPr>
-        <w:spacing w:after="80" w:line="360"/>
-        <w:ind w:firstLine="480"/>
-      </w:pPr>
-      <w:r>
-        <w:rPr>
-          <w:rFonts w:ascii="Times New Roman" w:eastAsia="SimSun" w:hAnsi="Times New Roman"/>
-          <w:sz w:val="24"/>
-          <w:szCs w:val="24"/>
-        </w:rPr>
-        <w:t xml:space="preserve">4. 关于松弛时间偏高的解释需要补充依据。式(41)直接给出∂L_consistency/∂λ&lt;0在λ∈[0.1,2.0]内成立，但文中没有给出推导或数值验证；按式(20)，T1展开后的第二项并不显含λ，分母S又依赖F，单调性并不显然。同时请说明实现中是否对S停止梯度。建议通过固定网络后的参数扫描、损失剖面或时间步长敏感性等方式加以检验。此外，训练方案未能恢复参数不等同于参数在理论上不可辨识，英文摘要中“理论可辨识性边界”的说法建议改为对当前设置下观察到的现象的描述。</w:t>
-      </w:r>
-    </w:p>
-    <w:p>
-      <w:pPr>
-        <w:spacing w:after="80" w:line="360"/>
-        <w:ind w:firstLine="480"/>
-      </w:pPr>
-      <w:r>
-        <w:rPr>
-          <w:rFonts w:ascii="Times New Roman" w:eastAsia="SimSun" w:hAnsi="Times New Roman"/>
-          <w:sz w:val="24"/>
-          <w:szCs w:val="24"/>
-        </w:rPr>
-        <w:t xml:space="preserve">5. 方程与时间递推部分的描述需要统一。第1.1节称“在稳态框架下忽略时间导数”，而算例是瞬态的，一致性损失本身就是对∂τ/∂t的离散，请明确式(19)中F的含义，给出由瞬态本构方程到式(18)的推导，并说明采用标准化时间步长后时间导数与空间导数的尺度如何保持一致。摘要中“以时间递推替代高阶空间导数”的说法也不准确，因为本构方程只含一阶空间导数，被替换的是时间导数。另外，文中列出了不可压缩条件，但损失函数中未见连续性方程残差，请补充说明其实现方式。</w:t>
-      </w:r>
-    </w:p>
-    <w:p>
-      <w:pPr>
-        <w:spacing w:after="80" w:line="360"/>
-        <w:ind w:firstLine="480"/>
-      </w:pPr>
-      <w:r>
-        <w:rPr>
-          <w:rFonts w:ascii="Times New Roman" w:eastAsia="SimSun" w:hAnsi="Times New Roman"/>
-          <w:sz w:val="24"/>
-          <w:szCs w:val="24"/>
-        </w:rPr>
-        <w:t xml:space="preserve">6. 训练中实际使用的信息条件尚不够清楚。除稀疏速度观测外，损失函数还涉及应力初边值、压力参考值，以及应力和压力的归一化统计量。建议作者区分可独立给定的物理条件与从参考解中提取的辅助信息，明确应力边界值是否取自参考解、标准差是否由全场参考数据计算，并说明其使用范围；同时请解释封闭方腔中inlet、outlet和压力出口条件分别对应哪些区域。在补充观测噪声和采样密度变化的验证之前，建议将“可与粒子图像测速直接衔接”改为潜在应用方向。</w:t>
-      </w:r>
-    </w:p>
-    <w:p>
-      <w:pPr>
-        <w:spacing w:after="80" w:line="360"/>
-        <w:ind w:firstLine="480"/>
-      </w:pPr>
-      <w:r>
-        <w:rPr>
-          <w:rFonts w:ascii="Times New Roman" w:eastAsia="SimSun" w:hAnsi="Times New Roman"/>
-          <w:sz w:val="24"/>
-          <w:szCs w:val="24"/>
-        </w:rPr>
-        <w:t xml:space="preserve">7. 数据设置与验证方案需要完善。第2.1节中总时长0.03 s、输出间隔0.01 s与16个快照按等间隔理解不能同时成立，请列出实际输出时刻。摘要中的“约6500个采样点”与第2.2节的1.29×10⁵个时空点之间的对应关系尚未说明，请明确两者是否分别指抽样观测点和全量参考数据，并分别报告观测点、配置点、初边值点和测试点的数量及采样方式。t=0为已知的零初始状态，且至少应力初值同时用于训练约束，因此以该快照作测试集不足以评价非平凡流场的重建能力，请说明测试变量与初值约束是否重叠，并在未参与训练的非零时刻或空间位置进行验证。第2.4节题为“场量预测对比”，但只给出了损失曲线，建议补充速度、应力、压力的参考场、预测场、误差场及相对L2误差。</w:t>
-      </w:r>
-    </w:p>
-    <w:p>
-      <w:pPr>
-        <w:spacing w:after="80" w:line="360"/>
-        <w:ind w:firstLine="480"/>
-      </w:pPr>
-      <w:r>
-        <w:rPr>
-          <w:rFonts w:ascii="Times New Roman" w:eastAsia="SimSun" w:hAnsi="Times New Roman"/>
-          <w:sz w:val="24"/>
-          <w:szCs w:val="24"/>
-        </w:rPr>
-        <w:t xml:space="preserve">8. 动态损失权重的解释与公式不完全对应。式(36)(37)中数据损失与一致性损失乘以同一个系数，二者的预设相对权重并不随训练进度改变，因此不能仅凭这两式推出“训练初期数据项主导、后期物理约束充分激活”的机制解释。建议结合各项加权损失以及梯度贡献随训练进度的变化，说明实际训练中各项的主导关系如何变化；初始条件权重在训练初期并未被降低而是随后衰减，也请一并核对。</w:t>
-      </w:r>
-    </w:p>
-    <w:p>
-      <w:pPr>
-        <w:spacing w:after="80" w:line="360"/>
-        <w:ind w:firstLine="480"/>
-      </w:pPr>
-      <w:r>
-        <w:rPr>
-          <w:rFonts w:ascii="Times New Roman" w:eastAsia="SimSun" w:hAnsi="Times New Roman"/>
-          <w:sz w:val="24"/>
-          <w:szCs w:val="24"/>
-        </w:rPr>
-        <w:t xml:space="preserve">9. “增强”效果需要对比实验支持。文章以ViscoelasticNet为主要比较对象，但未在相同数据和训练预算下给出直接对比；第2.5节的实验主要围绕先验展开，未分别检验参数变换、稀疏正则化、动态调度和逐点缩放各自的作用，“优于全局方差缩放”的结论缺少定量支撑。建议补充基线对比和针对性消融，在统一测试集上使用相同指标评价，并报告多次独立训练的结果（“24组鲁棒性实验”也请列出具体配置）。</w:t>
-      </w:r>
-    </w:p>
-    <w:p>
-      <w:pPr>
-        <w:spacing w:after="80" w:line="360"/>
-        <w:ind w:firstLine="480"/>
-      </w:pPr>
-      <w:r>
-        <w:rPr>
-          <w:rFonts w:ascii="Times New Roman" w:eastAsia="SimSun" w:hAnsi="Times New Roman"/>
-          <w:sz w:val="24"/>
-          <w:szCs w:val="24"/>
-        </w:rPr>
-        <w:t xml:space="preserve">10. 文中若干数值与表述需要统一核对：(1)第2.2节“黏度最大偏差不超过4%”应明确限定于表1的基准配置。表2中不同先验权重下的部分黏度误差明显增大（如Giesekus的ηp为0.0123～0.0151，真值0.01），请区分基准配置下的辨识精度与先验变化下的鲁棒性，避免将前者推广为普遍结论；(2)第2.5节的百分比与表格不符，例如称γλ=10⁻⁵时ε误差为3%、α误差为16%，而表2对应结果分别约为0.7%和6.6%，另称γλ=10⁻³时ε偏离23%，按0.0797计算约为20.3%，请明确各百分比对应的实验组；(3)“式(21)的力平衡机制”应为式(42)；(4)第1.4.3节所称“第3节的配置”指向结论章，请核对交叉引用，文中虽给出了部分损失权重，但第二阶段等配置仍不完整，建议集中提供完整超参数表；(5)表1未说明对应的γλ及其他先验配置，Giesekus和PTT的松弛时间真值以横线表示，而正文明确为0.1，请补齐并说明横线的含义。</w:t>
-      </w:r>
-    </w:p>
-    <w:p>
-      <w:pPr>
-        <w:spacing w:after="80" w:line="360"/>
-        <w:ind w:firstLine="480"/>
-      </w:pPr>
-      <w:r>
-        <w:rPr>
-          <w:rFonts w:ascii="Times New Roman" w:eastAsia="SimSun" w:hAnsi="Times New Roman"/>
-          <w:sz w:val="24"/>
-          <w:szCs w:val="24"/>
-        </w:rPr>
-        <w:t xml:space="preserve">11. 方法实现、复现信息及术语表述还需补充或规范：(1)softplus在有限输入下严格大于零，只能渐近趋零；exp与softplus本身均不提供上界。请将“归零”“保证有界性”等表述与实际的数值判定及裁剪操作区分。对于本文讨论的标量参数约束，建议使用“正性”或“非负性”等准确术语，并给出各参数的裁剪区间及依据。(2)式(26)计算的是均方根，并非标准差。(3)非有限导数置零、F裁剪等数值处理可能改变实际被优化的残差，请报告其触发频率。(4)请补充迭代次数、优化器、批量大小、学习率、各损失权重、先验均值和GPU型号等复现信息。(5)英文摘要中的“ViscoelasticNet++”未见于中文摘要和正文，请统一；“黏/粘”等术语也请统一。</w:t>
+        <w:t xml:space="preserve">1. 模型选择。式(33)按模型类型分别设置稀疏惩罚，哪个参数要压到零，实际上已由预设的模型类别决定。第1.5.2节自己写的是“给定模型假设下”，而摘要、第2.3节和结论却说成“自动甄别”“全部正确识别”，两者差别不小。请讲清楚实际使用时是否需要事先指定真实模型类别。如果不需要，应给出未知类别下的完整流程，并在不使用真实类别信息的条件下验证；如果是逐个候选模型拟合后再比较，要说明事先定好的比较准则；如果需要事先指定，题目、摘要和结论就应相应修改。另外，参数压到10⁻⁶量级不等于零，“近零”与“非零”如何判定也应交代。</w:t>
+      </w:r>
+    </w:p>
+    <w:p>
+      <w:pPr>
+        <w:spacing w:after="80" w:line="360"/>
+        <w:ind w:firstLine="480"/>
+      </w:pPr>
+      <w:r>
+        <w:rPr>
+          <w:rFonts w:ascii="Times New Roman" w:eastAsia="SimSun" w:hAnsi="Times New Roman"/>
+          <w:sz w:val="24"/>
+          <w:szCs w:val="24"/>
+        </w:rPr>
+        <w:t xml:space="preserve">2. 参数辨识结果。按表1计算，三个算例的松弛时间λ相对误差分别约为289%、286%和400%，Giesekus的α误差约19%。结论称“全部参数收敛至真值附近”，但表2在该先验权重区间内λ仍为0.42～0.56，与此不符。建议摘要和结论把黏度、松弛时间和非线性参数分开评价，λ未能恢复这一点应如实写明。</w:t>
+      </w:r>
+    </w:p>
+    <w:p>
+      <w:pPr>
+        <w:spacing w:after="80" w:line="360"/>
+        <w:ind w:firstLine="480"/>
+      </w:pPr>
+      <w:r>
+        <w:rPr>
+          <w:rFonts w:ascii="Times New Roman" w:eastAsia="SimSun" w:hAnsi="Times New Roman"/>
+          <w:sz w:val="24"/>
+          <w:szCs w:val="24"/>
+        </w:rPr>
+        <w:t xml:space="preserve">3. 先验的作用。表1中有些黏度参数在所报小数位上与真值完全一致，而第2.5节又说先验偏离真值时部分黏度参数会停在先验值附近，这样就很难判断黏度的小误差有多少来自数据、多少来自先验。请列出各参数先验的均值、权重、取值依据和初始化方式，说明先验有无独立来源；已做的无先验和先验偏差实验，请把配置和定量结果完整给出，并补充多次独立训练的统计结果。</w:t>
+      </w:r>
+    </w:p>
+    <w:p>
+      <w:pPr>
+        <w:spacing w:after="80" w:line="360"/>
+        <w:ind w:firstLine="480"/>
+      </w:pPr>
+      <w:r>
+        <w:rPr>
+          <w:rFonts w:ascii="Times New Roman" w:eastAsia="SimSun" w:hAnsi="Times New Roman"/>
+          <w:sz w:val="24"/>
+          <w:szCs w:val="24"/>
+        </w:rPr>
+        <w:t xml:space="preserve">4. 松弛时间偏高的解释。式(41)直接断言∂L_consistency/∂λ&lt;0在λ∈[0.1,2.0]内成立，文中既没有推导，也没有数值验证。按式(20)，T1展开后的第二项并不含λ，分母S又依赖F，单调性并不显然。另请说明实现中S是否停止梯度。可以通过固定网络后的参数扫描、损失剖面和时间步长敏感性来检验。此外，训练没有恢复出参数，并不等于参数在理论上不可辨识，英文摘要中“理论可辨识性边界”的说法建议改为对当前设置下观察到的现象的描述。</w:t>
+      </w:r>
+    </w:p>
+    <w:p>
+      <w:pPr>
+        <w:spacing w:after="80" w:line="360"/>
+        <w:ind w:firstLine="480"/>
+      </w:pPr>
+      <w:r>
+        <w:rPr>
+          <w:rFonts w:ascii="Times New Roman" w:eastAsia="SimSun" w:hAnsi="Times New Roman"/>
+          <w:sz w:val="24"/>
+          <w:szCs w:val="24"/>
+        </w:rPr>
+        <w:t xml:space="preserve">5. 方程与时间递推。第1.1节说“稳态框架下忽略时间导数”，但算例是瞬态的，一致性损失本身就是对∂τ/∂t的离散。请说明式(19)中的F具体指什么，给出从瞬态本构方程到式(18)的推导，并交代采用标准化时间步长之后，时间导数与空间导数的尺度如何保持一致。摘要中“以时间递推替代高阶空间导数”也不准确：本构方程只含一阶空间导数，被替换的是时间导数。另外，文中列出了不可压缩条件，但损失函数里没有连续性方程残差，请说明它是如何满足的。</w:t>
+      </w:r>
+    </w:p>
+    <w:p>
+      <w:pPr>
+        <w:spacing w:after="80" w:line="360"/>
+        <w:ind w:firstLine="480"/>
+      </w:pPr>
+      <w:r>
+        <w:rPr>
+          <w:rFonts w:ascii="Times New Roman" w:eastAsia="SimSun" w:hAnsi="Times New Roman"/>
+          <w:sz w:val="24"/>
+          <w:szCs w:val="24"/>
+        </w:rPr>
+        <w:t xml:space="preserve">6. 训练所用的信息。除速度观测外，损失中还用到应力初边值、压力参考值，以及应力和压力的归一化统计量。请区分哪些是可以独立给定的物理条件，哪些是从参考解中取出的辅助信息，并说明应力边界值是否取自参考解、标准差是否由全场数据算出、使用范围有多大。封闭方腔中的inlet、outlet和压力出口分别对应哪些位置，也请解释。在补充噪声和采样密度的验证之前，“可与粒子图像测速直接衔接”建议改为潜在应用方向。</w:t>
+      </w:r>
+    </w:p>
+    <w:p>
+      <w:pPr>
+        <w:spacing w:after="80" w:line="360"/>
+        <w:ind w:firstLine="480"/>
+      </w:pPr>
+      <w:r>
+        <w:rPr>
+          <w:rFonts w:ascii="Times New Roman" w:eastAsia="SimSun" w:hAnsi="Times New Roman"/>
+          <w:sz w:val="24"/>
+          <w:szCs w:val="24"/>
+        </w:rPr>
+        <w:t xml:space="preserve">7. 数据与验证。第2.1节中总时长0.03 s、输出间隔0.01 s和16个快照，按等间隔理解对不上，请给出实际的输出时刻。摘要中的“约6500个采样点”与第2.2节的1.29×10⁵个点是什么关系，文中没有交代，请说明二者是否分别为抽样观测点和全量参考数据，并分别给出观测点、配置点、初边值点和测试点的数量及采样方式。t=0是已知的零初始状态，至少应力初值还参与了训练约束，用它作测试集说明不了非平凡流场的重建效果，请说明测试变量与初值约束是否重叠，并在未参与训练的非零时刻或位置上验证。第2.4节标题为“场量预测对比”，实际只有损失曲线，建议补充速度、应力、压力的参考场、预测场、误差场及相对L2误差。</w:t>
+      </w:r>
+    </w:p>
+    <w:p>
+      <w:pPr>
+        <w:spacing w:after="80" w:line="360"/>
+        <w:ind w:firstLine="480"/>
+      </w:pPr>
+      <w:r>
+        <w:rPr>
+          <w:rFonts w:ascii="Times New Roman" w:eastAsia="SimSun" w:hAnsi="Times New Roman"/>
+          <w:sz w:val="24"/>
+          <w:szCs w:val="24"/>
+        </w:rPr>
+        <w:t xml:space="preserve">8. 损失权重调度。式(36)(37)给数据损失和一致性损失乘的是同一个系数，二者预设的相对权重不随训练变化，因此仅凭这两式推不出“前期数据项主导、后期物理约束充分激活”。请结合各项加权损失和梯度贡献随训练进度的变化来说明。初始条件权重在前期并未降低，而是之后才衰减，也请核对。</w:t>
+      </w:r>
+    </w:p>
+    <w:p>
+      <w:pPr>
+        <w:spacing w:after="80" w:line="360"/>
+        <w:ind w:firstLine="480"/>
+      </w:pPr>
+      <w:r>
+        <w:rPr>
+          <w:rFonts w:ascii="Times New Roman" w:eastAsia="SimSun" w:hAnsi="Times New Roman"/>
+          <w:sz w:val="24"/>
+          <w:szCs w:val="24"/>
+        </w:rPr>
+        <w:t xml:space="preserve">9. 对比与消融。文章主要与ViscoelasticNet比较，但没有在相同数据和训练预算下的直接对比。第2.5节的实验基本围绕先验展开，参数变换、稀疏正则、动态调度和逐点缩放各自的作用没有单独检验，“优于全局方差缩放”缺少定量依据。请补充基线对比和针对性消融，在统一的测试集上用相同指标评价，并给出多次独立训练的结果（“24组鲁棒性实验”的具体配置也请列出）。</w:t>
+      </w:r>
+    </w:p>
+    <w:p>
+      <w:pPr>
+        <w:spacing w:after="80" w:line="360"/>
+        <w:ind w:firstLine="480"/>
+      </w:pPr>
+      <w:r>
+        <w:rPr>
+          <w:rFonts w:ascii="Times New Roman" w:eastAsia="SimSun" w:hAnsi="Times New Roman"/>
+          <w:sz w:val="24"/>
+          <w:szCs w:val="24"/>
+        </w:rPr>
+        <w:t xml:space="preserve">10. 数字与表述的核对。(1)第2.2节“黏度最大偏差不超过4%”应限定在表1的基准配置。表2中不同先验权重下部分黏度误差明显变大（如Giesekus的ηp为0.0123～0.0151，真值0.01），请区分基准配置下的精度和先验变化下的鲁棒性，不要把前者推广为普遍结论。(2)第2.5节的百分比与表格对不上：称γλ=10⁻⁵时ε误差3%、α误差16%，而表2对应结果约为0.7%和6.6%；称γλ=10⁻³时ε偏离23%，按0.0797算约为20.3%。请明确各百分比对应哪一组实验。(3)“式(21)的力平衡机制”应为式(42)。(4)第1.4.3节所称“第3节的配置”指向的是结论章，请核对；文中给出了部分损失权重，但第二阶段等配置仍不完整，建议集中列一张超参数表。(5)表1未说明对应的γλ和其他先验配置；Giesekus和PTT的松弛时间真值以横线表示，而正文明确为0.1，请补齐并说明横线的含义。</w:t>
+      </w:r>
+    </w:p>
+    <w:p>
+      <w:pPr>
+        <w:spacing w:after="80" w:line="360"/>
+        <w:ind w:firstLine="480"/>
+      </w:pPr>
+      <w:r>
+        <w:rPr>
+          <w:rFonts w:ascii="Times New Roman" w:eastAsia="SimSun" w:hAnsi="Times New Roman"/>
+          <w:sz w:val="24"/>
+          <w:szCs w:val="24"/>
+        </w:rPr>
+        <w:t xml:space="preserve">11. 方法实现、复现信息及术语表述还需补充或规范。(1)softplus在有限输入下严格大于零，只能渐近趋零；exp与softplus本身均不提供上界。请把“归零”“保证有界性”等说法与实际的数值判定及裁剪操作区分开。对于本文讨论的标量参数，建议用“正性”或“非负性”等准确术语，并给出各参数的裁剪区间及依据。(2)式(26)算的是均方根，不是标准差。(3)非有限导数置零、F裁剪等数值处理可能改变实际被优化的残差，请报告它们的触发频率。(4)请补充迭代次数、优化器、批量大小、学习率、各损失权重、先验均值和GPU型号等信息。(5)英文摘要中的“ViscoelasticNet++”在中文摘要和正文中没有出现，请统一；“黏/粘”等用字也请统一。</w:t>
       </w:r>
     </w:p>
     <w:p>
@@ -390,7 +390,7 @@
           <w:sz w:val="24"/>
           <w:szCs w:val="24"/>
         </w:rPr>
-        <w:t xml:space="preserve">本文选题具有研究价值，但现有结果对模型自动甄别和参数可靠辨识的支持仍不充分。建议作者澄清模型选择流程与训练信息条件，补充关键对照和验证结果，并核对方程、实现及数据设置后，提交修改稿重审。</w:t>
+        <w:t xml:space="preserve">本文选题有研究价值，但现有结果对模型自动甄别和参数可靠辨识的支持仍不充分。建议作者澄清模型选择流程和训练所用信息，补充关键的对照与验证结果，并核对方程、实现及数据设置后，提交修改稿重审。</w:t>
       </w:r>
     </w:p>
     <w:sectPr>

</xml_diff>

<commit_message>
Remove fragment labels from review items
Co-Authored-By: Claude Sonnet 5.5 <noreply@anthropic.com>
Claude-Session: https://claude.ai/code/session_01W5KVGsn3NPSe2tZYET3Lj5
</commit_message>
<xml_diff>
--- a/审稿意见.docx
+++ b/审稿意见.docx
@@ -223,147 +223,147 @@
           <w:sz w:val="24"/>
           <w:szCs w:val="24"/>
         </w:rPr>
-        <w:t xml:space="preserve">1. 模型选择。式(33)按模型类型分别设置稀疏惩罚，哪个参数要压到零，实际上已由预设的模型类别决定。第1.5.2节自己写的是“给定模型假设下”，而摘要、第2.3节和结论却说成“自动甄别”“全部正确识别”，两者差别不小。请讲清楚实际使用时是否需要事先指定真实模型类别。如果不需要，应给出未知类别下的完整流程，并在不使用真实类别信息的条件下验证；如果是逐个候选模型拟合后再比较，要说明事先定好的比较准则；如果需要事先指定，题目、摘要和结论就应相应修改。另外，参数压到10⁻⁶量级不等于零，“近零”与“非零”如何判定也应交代。</w:t>
-      </w:r>
-    </w:p>
-    <w:p>
-      <w:pPr>
-        <w:spacing w:after="80" w:line="360"/>
-        <w:ind w:firstLine="480"/>
-      </w:pPr>
-      <w:r>
-        <w:rPr>
-          <w:rFonts w:ascii="Times New Roman" w:eastAsia="SimSun" w:hAnsi="Times New Roman"/>
-          <w:sz w:val="24"/>
-          <w:szCs w:val="24"/>
-        </w:rPr>
-        <w:t xml:space="preserve">2. 参数辨识结果。按表1计算，三个算例的松弛时间λ相对误差分别约为289%、286%和400%，Giesekus的α误差约19%。结论称“全部参数收敛至真值附近”，但表2在该先验权重区间内λ仍为0.42～0.56，与此不符。建议摘要和结论把黏度、松弛时间和非线性参数分开评价，λ未能恢复这一点应如实写明。</w:t>
-      </w:r>
-    </w:p>
-    <w:p>
-      <w:pPr>
-        <w:spacing w:after="80" w:line="360"/>
-        <w:ind w:firstLine="480"/>
-      </w:pPr>
-      <w:r>
-        <w:rPr>
-          <w:rFonts w:ascii="Times New Roman" w:eastAsia="SimSun" w:hAnsi="Times New Roman"/>
-          <w:sz w:val="24"/>
-          <w:szCs w:val="24"/>
-        </w:rPr>
-        <w:t xml:space="preserve">3. 先验的作用。表1中有些黏度参数在所报小数位上与真值完全一致，而第2.5节又说先验偏离真值时部分黏度参数会停在先验值附近，这样就很难判断黏度的小误差有多少来自数据、多少来自先验。请列出各参数先验的均值、权重、取值依据和初始化方式，说明先验有无独立来源；已做的无先验和先验偏差实验，请把配置和定量结果完整给出，并补充多次独立训练的统计结果。</w:t>
-      </w:r>
-    </w:p>
-    <w:p>
-      <w:pPr>
-        <w:spacing w:after="80" w:line="360"/>
-        <w:ind w:firstLine="480"/>
-      </w:pPr>
-      <w:r>
-        <w:rPr>
-          <w:rFonts w:ascii="Times New Roman" w:eastAsia="SimSun" w:hAnsi="Times New Roman"/>
-          <w:sz w:val="24"/>
-          <w:szCs w:val="24"/>
-        </w:rPr>
-        <w:t xml:space="preserve">4. 松弛时间偏高的解释。式(41)直接断言∂L_consistency/∂λ&lt;0在λ∈[0.1,2.0]内成立，文中既没有推导，也没有数值验证。按式(20)，T1展开后的第二项并不含λ，分母S又依赖F，单调性并不显然。另请说明实现中S是否停止梯度。可以通过固定网络后的参数扫描、损失剖面和时间步长敏感性来检验。此外，训练没有恢复出参数，并不等于参数在理论上不可辨识，英文摘要中“理论可辨识性边界”的说法建议改为对当前设置下观察到的现象的描述。</w:t>
-      </w:r>
-    </w:p>
-    <w:p>
-      <w:pPr>
-        <w:spacing w:after="80" w:line="360"/>
-        <w:ind w:firstLine="480"/>
-      </w:pPr>
-      <w:r>
-        <w:rPr>
-          <w:rFonts w:ascii="Times New Roman" w:eastAsia="SimSun" w:hAnsi="Times New Roman"/>
-          <w:sz w:val="24"/>
-          <w:szCs w:val="24"/>
-        </w:rPr>
-        <w:t xml:space="preserve">5. 方程与时间递推。第1.1节说“稳态框架下忽略时间导数”，但算例是瞬态的，一致性损失本身就是对∂τ/∂t的离散。请说明式(19)中的F具体指什么，给出从瞬态本构方程到式(18)的推导，并交代采用标准化时间步长之后，时间导数与空间导数的尺度如何保持一致。摘要中“以时间递推替代高阶空间导数”也不准确：本构方程只含一阶空间导数，被替换的是时间导数。另外，文中列出了不可压缩条件，但损失函数里没有连续性方程残差，请说明它是如何满足的。</w:t>
-      </w:r>
-    </w:p>
-    <w:p>
-      <w:pPr>
-        <w:spacing w:after="80" w:line="360"/>
-        <w:ind w:firstLine="480"/>
-      </w:pPr>
-      <w:r>
-        <w:rPr>
-          <w:rFonts w:ascii="Times New Roman" w:eastAsia="SimSun" w:hAnsi="Times New Roman"/>
-          <w:sz w:val="24"/>
-          <w:szCs w:val="24"/>
-        </w:rPr>
-        <w:t xml:space="preserve">6. 训练所用的信息。除速度观测外，损失中还用到应力初边值、压力参考值，以及应力和压力的归一化统计量。请区分哪些是可以独立给定的物理条件，哪些是从参考解中取出的辅助信息，并说明应力边界值是否取自参考解、标准差是否由全场数据算出、使用范围有多大。封闭方腔中的inlet、outlet和压力出口分别对应哪些位置，也请解释。在补充噪声和采样密度的验证之前，“可与粒子图像测速直接衔接”建议改为潜在应用方向。</w:t>
-      </w:r>
-    </w:p>
-    <w:p>
-      <w:pPr>
-        <w:spacing w:after="80" w:line="360"/>
-        <w:ind w:firstLine="480"/>
-      </w:pPr>
-      <w:r>
-        <w:rPr>
-          <w:rFonts w:ascii="Times New Roman" w:eastAsia="SimSun" w:hAnsi="Times New Roman"/>
-          <w:sz w:val="24"/>
-          <w:szCs w:val="24"/>
-        </w:rPr>
-        <w:t xml:space="preserve">7. 数据与验证。第2.1节中总时长0.03 s、输出间隔0.01 s和16个快照，按等间隔理解对不上，请给出实际的输出时刻。摘要中的“约6500个采样点”与第2.2节的1.29×10⁵个点是什么关系，文中没有交代，请说明二者是否分别为抽样观测点和全量参考数据，并分别给出观测点、配置点、初边值点和测试点的数量及采样方式。t=0是已知的零初始状态，至少应力初值还参与了训练约束，用它作测试集说明不了非平凡流场的重建效果，请说明测试变量与初值约束是否重叠，并在未参与训练的非零时刻或位置上验证。第2.4节标题为“场量预测对比”，实际只有损失曲线，建议补充速度、应力、压力的参考场、预测场、误差场及相对L2误差。</w:t>
-      </w:r>
-    </w:p>
-    <w:p>
-      <w:pPr>
-        <w:spacing w:after="80" w:line="360"/>
-        <w:ind w:firstLine="480"/>
-      </w:pPr>
-      <w:r>
-        <w:rPr>
-          <w:rFonts w:ascii="Times New Roman" w:eastAsia="SimSun" w:hAnsi="Times New Roman"/>
-          <w:sz w:val="24"/>
-          <w:szCs w:val="24"/>
-        </w:rPr>
-        <w:t xml:space="preserve">8. 损失权重调度。式(36)(37)给数据损失和一致性损失乘的是同一个系数，二者预设的相对权重不随训练变化，因此仅凭这两式推不出“前期数据项主导、后期物理约束充分激活”。请结合各项加权损失和梯度贡献随训练进度的变化来说明。初始条件权重在前期并未降低，而是之后才衰减，也请核对。</w:t>
-      </w:r>
-    </w:p>
-    <w:p>
-      <w:pPr>
-        <w:spacing w:after="80" w:line="360"/>
-        <w:ind w:firstLine="480"/>
-      </w:pPr>
-      <w:r>
-        <w:rPr>
-          <w:rFonts w:ascii="Times New Roman" w:eastAsia="SimSun" w:hAnsi="Times New Roman"/>
-          <w:sz w:val="24"/>
-          <w:szCs w:val="24"/>
-        </w:rPr>
-        <w:t xml:space="preserve">9. 对比与消融。文章主要与ViscoelasticNet比较，但没有在相同数据和训练预算下的直接对比。第2.5节的实验基本围绕先验展开，参数变换、稀疏正则、动态调度和逐点缩放各自的作用没有单独检验，“优于全局方差缩放”缺少定量依据。请补充基线对比和针对性消融，在统一的测试集上用相同指标评价，并给出多次独立训练的结果（“24组鲁棒性实验”的具体配置也请列出）。</w:t>
-      </w:r>
-    </w:p>
-    <w:p>
-      <w:pPr>
-        <w:spacing w:after="80" w:line="360"/>
-        <w:ind w:firstLine="480"/>
-      </w:pPr>
-      <w:r>
-        <w:rPr>
-          <w:rFonts w:ascii="Times New Roman" w:eastAsia="SimSun" w:hAnsi="Times New Roman"/>
-          <w:sz w:val="24"/>
-          <w:szCs w:val="24"/>
-        </w:rPr>
-        <w:t xml:space="preserve">10. 数字与表述的核对。(1)第2.2节“黏度最大偏差不超过4%”应限定在表1的基准配置。表2中不同先验权重下部分黏度误差明显变大（如Giesekus的ηp为0.0123～0.0151，真值0.01），请区分基准配置下的精度和先验变化下的鲁棒性，不要把前者推广为普遍结论。(2)第2.5节的百分比与表格对不上：称γλ=10⁻⁵时ε误差3%、α误差16%，而表2对应结果约为0.7%和6.6%；称γλ=10⁻³时ε偏离23%，按0.0797算约为20.3%。请明确各百分比对应哪一组实验。(3)“式(21)的力平衡机制”应为式(42)。(4)第1.4.3节所称“第3节的配置”指向的是结论章，请核对；文中给出了部分损失权重，但第二阶段等配置仍不完整，建议集中列一张超参数表。(5)表1未说明对应的γλ和其他先验配置；Giesekus和PTT的松弛时间真值以横线表示，而正文明确为0.1，请补齐并说明横线的含义。</w:t>
-      </w:r>
-    </w:p>
-    <w:p>
-      <w:pPr>
-        <w:spacing w:after="80" w:line="360"/>
-        <w:ind w:firstLine="480"/>
-      </w:pPr>
-      <w:r>
-        <w:rPr>
-          <w:rFonts w:ascii="Times New Roman" w:eastAsia="SimSun" w:hAnsi="Times New Roman"/>
-          <w:sz w:val="24"/>
-          <w:szCs w:val="24"/>
-        </w:rPr>
-        <w:t xml:space="preserve">11. 方法实现、复现信息及术语表述还需补充或规范。(1)softplus在有限输入下严格大于零，只能渐近趋零；exp与softplus本身均不提供上界。请把“归零”“保证有界性”等说法与实际的数值判定及裁剪操作区分开。对于本文讨论的标量参数，建议用“正性”或“非负性”等准确术语，并给出各参数的裁剪区间及依据。(2)式(26)算的是均方根，不是标准差。(3)非有限导数置零、F裁剪等数值处理可能改变实际被优化的残差，请报告它们的触发频率。(4)请补充迭代次数、优化器、批量大小、学习率、各损失权重、先验均值和GPU型号等信息。(5)英文摘要中的“ViscoelasticNet++”在中文摘要和正文中没有出现，请统一；“黏/粘”等用字也请统一。</w:t>
+        <w:t xml:space="preserve">1. 式(33)按模型类型分别设置稀疏惩罚，哪个参数要压到零，实际上已由预设的模型类别决定。第1.5.2节自己写的是“给定模型假设下”，而摘要、第2.3节和结论却说成“自动甄别”“全部正确识别”，两者差别不小。请讲清楚实际使用时是否需要事先指定真实模型类别。如果不需要，应给出未知类别下的完整流程，并在不使用真实类别信息的条件下验证；如果是逐个候选模型拟合后再比较，要说明事先定好的比较准则；如果需要事先指定，题目、摘要和结论就应相应修改。另外，参数压到10⁻⁶量级不等于零，“近零”与“非零”如何判定也应交代。</w:t>
+      </w:r>
+    </w:p>
+    <w:p>
+      <w:pPr>
+        <w:spacing w:after="80" w:line="360"/>
+        <w:ind w:firstLine="480"/>
+      </w:pPr>
+      <w:r>
+        <w:rPr>
+          <w:rFonts w:ascii="Times New Roman" w:eastAsia="SimSun" w:hAnsi="Times New Roman"/>
+          <w:sz w:val="24"/>
+          <w:szCs w:val="24"/>
+        </w:rPr>
+        <w:t xml:space="preserve">2. 按表1计算，三个算例的松弛时间λ相对误差分别约为289%、286%和400%，Giesekus的α误差约19%。结论称“全部参数收敛至真值附近”，但表2在该先验权重区间内λ仍为0.42～0.56，与此不符。建议摘要和结论把黏度、松弛时间和非线性参数分开评价，λ未能恢复这一点应如实写明。</w:t>
+      </w:r>
+    </w:p>
+    <w:p>
+      <w:pPr>
+        <w:spacing w:after="80" w:line="360"/>
+        <w:ind w:firstLine="480"/>
+      </w:pPr>
+      <w:r>
+        <w:rPr>
+          <w:rFonts w:ascii="Times New Roman" w:eastAsia="SimSun" w:hAnsi="Times New Roman"/>
+          <w:sz w:val="24"/>
+          <w:szCs w:val="24"/>
+        </w:rPr>
+        <w:t xml:space="preserve">3. 表1中有些黏度参数在所报小数位上与真值完全一致，而第2.5节又说先验偏离真值时部分黏度参数会停在先验值附近，这样就很难判断黏度的小误差有多少来自数据、多少来自先验。请列出各参数先验的均值、权重、取值依据和初始化方式，说明先验有无独立来源；已做的无先验和先验偏差实验，请把配置和定量结果完整给出，并补充多次独立训练的统计结果。</w:t>
+      </w:r>
+    </w:p>
+    <w:p>
+      <w:pPr>
+        <w:spacing w:after="80" w:line="360"/>
+        <w:ind w:firstLine="480"/>
+      </w:pPr>
+      <w:r>
+        <w:rPr>
+          <w:rFonts w:ascii="Times New Roman" w:eastAsia="SimSun" w:hAnsi="Times New Roman"/>
+          <w:sz w:val="24"/>
+          <w:szCs w:val="24"/>
+        </w:rPr>
+        <w:t xml:space="preserve">4. 关于松弛时间偏高，式(41)直接断言∂L_consistency/∂λ&lt;0在λ∈[0.1,2.0]内成立，文中既没有推导，也没有数值验证。按式(20)，T1展开后的第二项并不含λ，分母S又依赖F，单调性并不显然。另请说明实现中S是否停止梯度。可以通过固定网络后的参数扫描、损失剖面和时间步长敏感性来检验。此外，训练没有恢复出参数，并不等于参数在理论上不可辨识，英文摘要中“理论可辨识性边界”的说法建议改为对当前设置下观察到的现象的描述。</w:t>
+      </w:r>
+    </w:p>
+    <w:p>
+      <w:pPr>
+        <w:spacing w:after="80" w:line="360"/>
+        <w:ind w:firstLine="480"/>
+      </w:pPr>
+      <w:r>
+        <w:rPr>
+          <w:rFonts w:ascii="Times New Roman" w:eastAsia="SimSun" w:hAnsi="Times New Roman"/>
+          <w:sz w:val="24"/>
+          <w:szCs w:val="24"/>
+        </w:rPr>
+        <w:t xml:space="preserve">5. 第1.1节说“稳态框架下忽略时间导数”，但算例是瞬态的，一致性损失本身就是对∂τ/∂t的离散。请说明式(19)中的F具体指什么，给出从瞬态本构方程到式(18)的推导，并交代采用标准化时间步长之后，时间导数与空间导数的尺度如何保持一致。摘要中“以时间递推替代高阶空间导数”也不准确：本构方程只含一阶空间导数，被替换的是时间导数。另外，文中列出了不可压缩条件，但损失函数里没有连续性方程残差，请说明它是如何满足的。</w:t>
+      </w:r>
+    </w:p>
+    <w:p>
+      <w:pPr>
+        <w:spacing w:after="80" w:line="360"/>
+        <w:ind w:firstLine="480"/>
+      </w:pPr>
+      <w:r>
+        <w:rPr>
+          <w:rFonts w:ascii="Times New Roman" w:eastAsia="SimSun" w:hAnsi="Times New Roman"/>
+          <w:sz w:val="24"/>
+          <w:szCs w:val="24"/>
+        </w:rPr>
+        <w:t xml:space="preserve">6. 除速度观测外，损失中还用到应力初边值、压力参考值，以及应力和压力的归一化统计量。请区分哪些是可以独立给定的物理条件，哪些是从参考解中取出的辅助信息，并说明应力边界值是否取自参考解、标准差是否由全场数据算出、使用范围有多大。封闭方腔中的inlet、outlet和压力出口分别对应哪些位置，也请解释。在补充噪声和采样密度的验证之前，“可与粒子图像测速直接衔接”建议改为潜在应用方向。</w:t>
+      </w:r>
+    </w:p>
+    <w:p>
+      <w:pPr>
+        <w:spacing w:after="80" w:line="360"/>
+        <w:ind w:firstLine="480"/>
+      </w:pPr>
+      <w:r>
+        <w:rPr>
+          <w:rFonts w:ascii="Times New Roman" w:eastAsia="SimSun" w:hAnsi="Times New Roman"/>
+          <w:sz w:val="24"/>
+          <w:szCs w:val="24"/>
+        </w:rPr>
+        <w:t xml:space="preserve">7. 第2.1节中总时长0.03 s、输出间隔0.01 s和16个快照，按等间隔理解对不上，请给出实际的输出时刻。摘要中的“约6500个采样点”与第2.2节的1.29×10⁵个点是什么关系，文中没有交代，请说明二者是否分别为抽样观测点和全量参考数据，并分别给出观测点、配置点、初边值点和测试点的数量及采样方式。t=0是已知的零初始状态，至少应力初值还参与了训练约束，用它作测试集说明不了非平凡流场的重建效果，请说明测试变量与初值约束是否重叠，并在未参与训练的非零时刻或位置上验证。第2.4节标题为“场量预测对比”，实际只有损失曲线，建议补充速度、应力、压力的参考场、预测场、误差场及相对L2误差。</w:t>
+      </w:r>
+    </w:p>
+    <w:p>
+      <w:pPr>
+        <w:spacing w:after="80" w:line="360"/>
+        <w:ind w:firstLine="480"/>
+      </w:pPr>
+      <w:r>
+        <w:rPr>
+          <w:rFonts w:ascii="Times New Roman" w:eastAsia="SimSun" w:hAnsi="Times New Roman"/>
+          <w:sz w:val="24"/>
+          <w:szCs w:val="24"/>
+        </w:rPr>
+        <w:t xml:space="preserve">8. 式(36)(37)给数据损失和一致性损失乘的是同一个系数，二者预设的相对权重不随训练变化，因此仅凭这两式推不出“前期数据项主导、后期物理约束充分激活”。请结合各项加权损失和梯度贡献随训练进度的变化来说明。初始条件权重在前期并未降低，而是之后才衰减，也请核对。</w:t>
+      </w:r>
+    </w:p>
+    <w:p>
+      <w:pPr>
+        <w:spacing w:after="80" w:line="360"/>
+        <w:ind w:firstLine="480"/>
+      </w:pPr>
+      <w:r>
+        <w:rPr>
+          <w:rFonts w:ascii="Times New Roman" w:eastAsia="SimSun" w:hAnsi="Times New Roman"/>
+          <w:sz w:val="24"/>
+          <w:szCs w:val="24"/>
+        </w:rPr>
+        <w:t xml:space="preserve">9. 文章主要与ViscoelasticNet比较，但没有在相同数据和训练预算下的直接对比。第2.5节的实验基本围绕先验展开，参数变换、稀疏正则、动态调度和逐点缩放各自的作用没有单独检验，“优于全局方差缩放”缺少定量依据。请补充基线对比和针对性消融，在统一的测试集上用相同指标评价，并给出多次独立训练的结果（“24组鲁棒性实验”的具体配置也请列出）。</w:t>
+      </w:r>
+    </w:p>
+    <w:p>
+      <w:pPr>
+        <w:spacing w:after="80" w:line="360"/>
+        <w:ind w:firstLine="480"/>
+      </w:pPr>
+      <w:r>
+        <w:rPr>
+          <w:rFonts w:ascii="Times New Roman" w:eastAsia="SimSun" w:hAnsi="Times New Roman"/>
+          <w:sz w:val="24"/>
+          <w:szCs w:val="24"/>
+        </w:rPr>
+        <w:t xml:space="preserve">10. 文中部分数字和表述前后不一致，请核对。(1)第2.2节“黏度最大偏差不超过4%”应限定在表1的基准配置。表2中不同先验权重下部分黏度误差明显变大（如Giesekus的ηp为0.0123～0.0151，真值0.01），请区分基准配置下的精度和先验变化下的鲁棒性，不要把前者推广为普遍结论。(2)第2.5节的百分比与表格对不上：称γλ=10⁻⁵时ε误差3%、α误差16%，而表2对应结果约为0.7%和6.6%；称γλ=10⁻³时ε偏离23%，按0.0797算约为20.3%。请明确各百分比对应哪一组实验。(3)“式(21)的力平衡机制”应为式(42)。(4)第1.4.3节所称“第3节的配置”指向的是结论章，请核对；文中给出了部分损失权重，但第二阶段等配置仍不完整，建议集中列一张超参数表。(5)表1未说明对应的γλ和其他先验配置；Giesekus和PTT的松弛时间真值以横线表示，而正文明确为0.1，请补齐并说明横线的含义。</w:t>
+      </w:r>
+    </w:p>
+    <w:p>
+      <w:pPr>
+        <w:spacing w:after="80" w:line="360"/>
+        <w:ind w:firstLine="480"/>
+      </w:pPr>
+      <w:r>
+        <w:rPr>
+          <w:rFonts w:ascii="Times New Roman" w:eastAsia="SimSun" w:hAnsi="Times New Roman"/>
+          <w:sz w:val="24"/>
+          <w:szCs w:val="24"/>
+        </w:rPr>
+        <w:t xml:space="preserve">11. 此外，方法实现、复现信息和术语表述还需补充规范。(1)softplus在有限输入下严格大于零，只能渐近趋零；exp与softplus本身均不提供上界。请把“归零”“保证有界性”等说法与实际的数值判定及裁剪操作区分开。对于本文讨论的标量参数，建议用“正性”或“非负性”等准确术语，并给出各参数的裁剪区间及依据。(2)式(26)算的是均方根，不是标准差。(3)非有限导数置零、F裁剪等数值处理可能改变实际被优化的残差，请报告它们的触发频率。(4)请补充迭代次数、优化器、批量大小、学习率、各损失权重、先验均值和GPU型号等信息。(5)英文摘要中的“ViscoelasticNet++”在中文摘要和正文中没有出现，请统一；“黏/粘”等用字也请统一。</w:t>
       </w:r>
     </w:p>
     <w:p>

</xml_diff>

<commit_message>
Polish review comments wording
Co-Authored-By: Claude Opus 5.5 <noreply@anthropic.com>
Claude-Session: https://claude.ai/code/session_01W5KVGsn3NPSe2tZYET3Lj5
</commit_message>
<xml_diff>
--- a/审稿意见.docx
+++ b/审稿意见.docx
@@ -169,7 +169,7 @@
           <w:sz w:val="24"/>
           <w:szCs w:val="24"/>
         </w:rPr>
-        <w:t xml:space="preserve">本文在统一本构方程下（Oldroyd-B、Giesekus、线性PTT），用物理信息神经网络从速度场反演本构参数并判别模型类型。作者对参数做了指数/softplus变换，加入对数–高斯先验和稀疏正则，损失权重随训练进度调整，并提出了按点缩放的、基于时间递推的本构一致性损失。算例为二维瞬态顶盖驱动方腔流，文中称三类模型均被正确识别，并分析了先验对收敛的影响。</w:t>
+        <w:t xml:space="preserve">本文基于统一本构方程（涵盖Oldroyd-B、Giesekus和线性PTT模型），利用物理信息神经网络由速度场反演本构参数并判别模型类型。方法上，作者对物理参数施加指数/softplus变换，引入对数–高斯先验与稀疏正则化，按训练进度调整损失权重，并构造了基于时间递推、逐点缩放的本构一致性损失。文章以二维瞬态顶盖驱动方腔流为算例，报告三类模型均得到正确识别，并讨论了先验设置对参数收敛的影响。</w:t>
       </w:r>
     </w:p>
     <w:p>
@@ -196,7 +196,7 @@
           <w:sz w:val="24"/>
           <w:szCs w:val="24"/>
         </w:rPr>
-        <w:t xml:space="preserve">这个问题有研究意义，文章在参数约束和训练稳定性上下了不少功夫，先验敏感性的分析也有参考价值。但目前的结果还撑不起摘要中“自动甄别模型”和“可靠辨识参数”的结论，另外方程描述、数据设置和部分数字前后对不上。具体意见如下。</w:t>
+        <w:t xml:space="preserve">本文选题具有研究意义，作者在参数约束与训练稳定性方面做了较多工作，关于先验敏感性的分析也有一定参考价值。但就现有结果而言，尚不足以支撑摘要中“自动甄别本构模型”和“可靠辨识本构参数”的结论；此外，方程表述、数据设置及部分数值也存在前后不一致之处。具体意见如下。</w:t>
       </w:r>
     </w:p>
     <w:p>
@@ -223,147 +223,147 @@
           <w:sz w:val="24"/>
           <w:szCs w:val="24"/>
         </w:rPr>
-        <w:t xml:space="preserve">1. 式(33)按模型类型分别设置稀疏惩罚，哪个参数要压到零，实际上已由预设的模型类别决定。第1.5.2节自己写的是“给定模型假设下”，而摘要、第2.3节和结论却说成“自动甄别”“全部正确识别”，两者差别不小。请讲清楚实际使用时是否需要事先指定真实模型类别。如果不需要，应给出未知类别下的完整流程，并在不使用真实类别信息的条件下验证；如果是逐个候选模型拟合后再比较，要说明事先定好的比较准则；如果需要事先指定，题目、摘要和结论就应相应修改。另外，参数压到10⁻⁶量级不等于零，“近零”与“非零”如何判定也应交代。</w:t>
-      </w:r>
-    </w:p>
-    <w:p>
-      <w:pPr>
-        <w:spacing w:after="80" w:line="360"/>
-        <w:ind w:firstLine="480"/>
-      </w:pPr>
-      <w:r>
-        <w:rPr>
-          <w:rFonts w:ascii="Times New Roman" w:eastAsia="SimSun" w:hAnsi="Times New Roman"/>
-          <w:sz w:val="24"/>
-          <w:szCs w:val="24"/>
-        </w:rPr>
-        <w:t xml:space="preserve">2. 按表1计算，三个算例的松弛时间λ相对误差分别约为289%、286%和400%，Giesekus的α误差约19%。结论称“全部参数收敛至真值附近”，但表2在该先验权重区间内λ仍为0.42～0.56，与此不符。建议摘要和结论把黏度、松弛时间和非线性参数分开评价，λ未能恢复这一点应如实写明。</w:t>
-      </w:r>
-    </w:p>
-    <w:p>
-      <w:pPr>
-        <w:spacing w:after="80" w:line="360"/>
-        <w:ind w:firstLine="480"/>
-      </w:pPr>
-      <w:r>
-        <w:rPr>
-          <w:rFonts w:ascii="Times New Roman" w:eastAsia="SimSun" w:hAnsi="Times New Roman"/>
-          <w:sz w:val="24"/>
-          <w:szCs w:val="24"/>
-        </w:rPr>
-        <w:t xml:space="preserve">3. 表1中有些黏度参数在所报小数位上与真值完全一致，而第2.5节又说先验偏离真值时部分黏度参数会停在先验值附近，这样就很难判断黏度的小误差有多少来自数据、多少来自先验。请列出各参数先验的均值、权重、取值依据和初始化方式，说明先验有无独立来源；已做的无先验和先验偏差实验，请把配置和定量结果完整给出，并补充多次独立训练的统计结果。</w:t>
-      </w:r>
-    </w:p>
-    <w:p>
-      <w:pPr>
-        <w:spacing w:after="80" w:line="360"/>
-        <w:ind w:firstLine="480"/>
-      </w:pPr>
-      <w:r>
-        <w:rPr>
-          <w:rFonts w:ascii="Times New Roman" w:eastAsia="SimSun" w:hAnsi="Times New Roman"/>
-          <w:sz w:val="24"/>
-          <w:szCs w:val="24"/>
-        </w:rPr>
-        <w:t xml:space="preserve">4. 关于松弛时间偏高，式(41)直接断言∂L_consistency/∂λ&lt;0在λ∈[0.1,2.0]内成立，文中既没有推导，也没有数值验证。按式(20)，T1展开后的第二项并不含λ，分母S又依赖F，单调性并不显然。另请说明实现中S是否停止梯度。可以通过固定网络后的参数扫描、损失剖面和时间步长敏感性来检验。此外，训练没有恢复出参数，并不等于参数在理论上不可辨识，英文摘要中“理论可辨识性边界”的说法建议改为对当前设置下观察到的现象的描述。</w:t>
-      </w:r>
-    </w:p>
-    <w:p>
-      <w:pPr>
-        <w:spacing w:after="80" w:line="360"/>
-        <w:ind w:firstLine="480"/>
-      </w:pPr>
-      <w:r>
-        <w:rPr>
-          <w:rFonts w:ascii="Times New Roman" w:eastAsia="SimSun" w:hAnsi="Times New Roman"/>
-          <w:sz w:val="24"/>
-          <w:szCs w:val="24"/>
-        </w:rPr>
-        <w:t xml:space="preserve">5. 第1.1节说“稳态框架下忽略时间导数”，但算例是瞬态的，一致性损失本身就是对∂τ/∂t的离散。请说明式(19)中的F具体指什么，给出从瞬态本构方程到式(18)的推导，并交代采用标准化时间步长之后，时间导数与空间导数的尺度如何保持一致。摘要中“以时间递推替代高阶空间导数”也不准确：本构方程只含一阶空间导数，被替换的是时间导数。另外，文中列出了不可压缩条件，但损失函数里没有连续性方程残差，请说明它是如何满足的。</w:t>
-      </w:r>
-    </w:p>
-    <w:p>
-      <w:pPr>
-        <w:spacing w:after="80" w:line="360"/>
-        <w:ind w:firstLine="480"/>
-      </w:pPr>
-      <w:r>
-        <w:rPr>
-          <w:rFonts w:ascii="Times New Roman" w:eastAsia="SimSun" w:hAnsi="Times New Roman"/>
-          <w:sz w:val="24"/>
-          <w:szCs w:val="24"/>
-        </w:rPr>
-        <w:t xml:space="preserve">6. 除速度观测外，损失中还用到应力初边值、压力参考值，以及应力和压力的归一化统计量。请区分哪些是可以独立给定的物理条件，哪些是从参考解中取出的辅助信息，并说明应力边界值是否取自参考解、标准差是否由全场数据算出、使用范围有多大。封闭方腔中的inlet、outlet和压力出口分别对应哪些位置，也请解释。在补充噪声和采样密度的验证之前，“可与粒子图像测速直接衔接”建议改为潜在应用方向。</w:t>
-      </w:r>
-    </w:p>
-    <w:p>
-      <w:pPr>
-        <w:spacing w:after="80" w:line="360"/>
-        <w:ind w:firstLine="480"/>
-      </w:pPr>
-      <w:r>
-        <w:rPr>
-          <w:rFonts w:ascii="Times New Roman" w:eastAsia="SimSun" w:hAnsi="Times New Roman"/>
-          <w:sz w:val="24"/>
-          <w:szCs w:val="24"/>
-        </w:rPr>
-        <w:t xml:space="preserve">7. 第2.1节中总时长0.03 s、输出间隔0.01 s和16个快照，按等间隔理解对不上，请给出实际的输出时刻。摘要中的“约6500个采样点”与第2.2节的1.29×10⁵个点是什么关系，文中没有交代，请说明二者是否分别为抽样观测点和全量参考数据，并分别给出观测点、配置点、初边值点和测试点的数量及采样方式。t=0是已知的零初始状态，至少应力初值还参与了训练约束，用它作测试集说明不了非平凡流场的重建效果，请说明测试变量与初值约束是否重叠，并在未参与训练的非零时刻或位置上验证。第2.4节标题为“场量预测对比”，实际只有损失曲线，建议补充速度、应力、压力的参考场、预测场、误差场及相对L2误差。</w:t>
-      </w:r>
-    </w:p>
-    <w:p>
-      <w:pPr>
-        <w:spacing w:after="80" w:line="360"/>
-        <w:ind w:firstLine="480"/>
-      </w:pPr>
-      <w:r>
-        <w:rPr>
-          <w:rFonts w:ascii="Times New Roman" w:eastAsia="SimSun" w:hAnsi="Times New Roman"/>
-          <w:sz w:val="24"/>
-          <w:szCs w:val="24"/>
-        </w:rPr>
-        <w:t xml:space="preserve">8. 式(36)(37)给数据损失和一致性损失乘的是同一个系数，二者预设的相对权重不随训练变化，因此仅凭这两式推不出“前期数据项主导、后期物理约束充分激活”。请结合各项加权损失和梯度贡献随训练进度的变化来说明。初始条件权重在前期并未降低，而是之后才衰减，也请核对。</w:t>
-      </w:r>
-    </w:p>
-    <w:p>
-      <w:pPr>
-        <w:spacing w:after="80" w:line="360"/>
-        <w:ind w:firstLine="480"/>
-      </w:pPr>
-      <w:r>
-        <w:rPr>
-          <w:rFonts w:ascii="Times New Roman" w:eastAsia="SimSun" w:hAnsi="Times New Roman"/>
-          <w:sz w:val="24"/>
-          <w:szCs w:val="24"/>
-        </w:rPr>
-        <w:t xml:space="preserve">9. 文章主要与ViscoelasticNet比较，但没有在相同数据和训练预算下的直接对比。第2.5节的实验基本围绕先验展开，参数变换、稀疏正则、动态调度和逐点缩放各自的作用没有单独检验，“优于全局方差缩放”缺少定量依据。请补充基线对比和针对性消融，在统一的测试集上用相同指标评价，并给出多次独立训练的结果（“24组鲁棒性实验”的具体配置也请列出）。</w:t>
-      </w:r>
-    </w:p>
-    <w:p>
-      <w:pPr>
-        <w:spacing w:after="80" w:line="360"/>
-        <w:ind w:firstLine="480"/>
-      </w:pPr>
-      <w:r>
-        <w:rPr>
-          <w:rFonts w:ascii="Times New Roman" w:eastAsia="SimSun" w:hAnsi="Times New Roman"/>
-          <w:sz w:val="24"/>
-          <w:szCs w:val="24"/>
-        </w:rPr>
-        <w:t xml:space="preserve">10. 文中部分数字和表述前后不一致，请核对。(1)第2.2节“黏度最大偏差不超过4%”应限定在表1的基准配置。表2中不同先验权重下部分黏度误差明显变大（如Giesekus的ηp为0.0123～0.0151，真值0.01），请区分基准配置下的精度和先验变化下的鲁棒性，不要把前者推广为普遍结论。(2)第2.5节的百分比与表格对不上：称γλ=10⁻⁵时ε误差3%、α误差16%，而表2对应结果约为0.7%和6.6%；称γλ=10⁻³时ε偏离23%，按0.0797算约为20.3%。请明确各百分比对应哪一组实验。(3)“式(21)的力平衡机制”应为式(42)。(4)第1.4.3节所称“第3节的配置”指向的是结论章，请核对；文中给出了部分损失权重，但第二阶段等配置仍不完整，建议集中列一张超参数表。(5)表1未说明对应的γλ和其他先验配置；Giesekus和PTT的松弛时间真值以横线表示，而正文明确为0.1，请补齐并说明横线的含义。</w:t>
-      </w:r>
-    </w:p>
-    <w:p>
-      <w:pPr>
-        <w:spacing w:after="80" w:line="360"/>
-        <w:ind w:firstLine="480"/>
-      </w:pPr>
-      <w:r>
-        <w:rPr>
-          <w:rFonts w:ascii="Times New Roman" w:eastAsia="SimSun" w:hAnsi="Times New Roman"/>
-          <w:sz w:val="24"/>
-          <w:szCs w:val="24"/>
-        </w:rPr>
-        <w:t xml:space="preserve">11. 此外，方法实现、复现信息和术语表述还需补充规范。(1)softplus在有限输入下严格大于零，只能渐近趋零；exp与softplus本身均不提供上界。请把“归零”“保证有界性”等说法与实际的数值判定及裁剪操作区分开。对于本文讨论的标量参数，建议用“正性”或“非负性”等准确术语，并给出各参数的裁剪区间及依据。(2)式(26)算的是均方根，不是标准差。(3)非有限导数置零、F裁剪等数值处理可能改变实际被优化的残差，请报告它们的触发频率。(4)请补充迭代次数、优化器、批量大小、学习率、各损失权重、先验均值和GPU型号等信息。(5)英文摘要中的“ViscoelasticNet++”在中文摘要和正文中没有出现，请统一；“黏/粘”等用字也请统一。</w:t>
+        <w:t xml:space="preserve">1. 式(33)针对不同模型分别设置稀疏惩罚，换言之，哪些参数应被压缩至零已由预设的模型类别决定。第1.5.2节将其限定为“给定模型假设下的参数识别”，而摘要、第2.3节及结论则表述为“自动甄别”“全部正确识别”，二者口径不一。请作者说明实际应用时是否需要预先指定真实模型类别：若不需要，应给出未知类别条件下的完整辨识流程，并在不使用真实类别信息的前提下加以验证；若采用候选模型逐一拟合再比较的方式，应说明事先确定的选择准则；若需要预先指定，则建议相应修改题目、摘要和结论。此外，参数被压缩至10⁻⁶量级并不等同于严格为零，“近零”与“非零”的判定规则也需交代。</w:t>
+      </w:r>
+    </w:p>
+    <w:p>
+      <w:pPr>
+        <w:spacing w:after="80" w:line="360"/>
+        <w:ind w:firstLine="480"/>
+      </w:pPr>
+      <w:r>
+        <w:rPr>
+          <w:rFonts w:ascii="Times New Roman" w:eastAsia="SimSun" w:hAnsi="Times New Roman"/>
+          <w:sz w:val="24"/>
+          <w:szCs w:val="24"/>
+        </w:rPr>
+        <w:t xml:space="preserve">2. 根据表1计算，三个算例中松弛时间λ的相对误差分别约为289%、286%和400%，Giesekus模型中α的相对误差约为19%。结论称先验权重在5×10⁻⁴～10⁻³区间内“全部参数收敛至真值附近”，但表2中该区间λ仍为0.42～0.56，与真值0.1相差较大。建议在摘要和结论中对黏度、松弛时间和非线性参数分别评价，并如实说明λ目前未能准确恢复。</w:t>
+      </w:r>
+    </w:p>
+    <w:p>
+      <w:pPr>
+        <w:spacing w:after="80" w:line="360"/>
+        <w:ind w:firstLine="480"/>
+      </w:pPr>
+      <w:r>
+        <w:rPr>
+          <w:rFonts w:ascii="Times New Roman" w:eastAsia="SimSun" w:hAnsi="Times New Roman"/>
+          <w:sz w:val="24"/>
+          <w:szCs w:val="24"/>
+        </w:rPr>
+        <w:t xml:space="preserve">3. 表1中部分黏度参数在所报告的小数位上与真值完全一致，而第2.5节又指出，当先验偏离真值时，部分黏度参数会停留在先验值附近。由此难以判断黏度的小误差在多大程度上来自观测数据，又在多大程度上来自先验。建议作者列出各参数先验的均值、权重、取值依据及初始化方式，并说明先验是否有独立来源；对于已开展的无先验和先验偏差实验，请完整给出配置与定量结果，同时补充多次独立训练的统计结果。</w:t>
+      </w:r>
+    </w:p>
+    <w:p>
+      <w:pPr>
+        <w:spacing w:after="80" w:line="360"/>
+        <w:ind w:firstLine="480"/>
+      </w:pPr>
+      <w:r>
+        <w:rPr>
+          <w:rFonts w:ascii="Times New Roman" w:eastAsia="SimSun" w:hAnsi="Times New Roman"/>
+          <w:sz w:val="24"/>
+          <w:szCs w:val="24"/>
+        </w:rPr>
+        <w:t xml:space="preserve">4. 作者将松弛时间的系统性偏高归因于式(41)，即∂L_consistency/∂λ&lt;0在λ∈[0.1,2.0]内恒成立，但文中既未给出推导，也未提供数值验证。由式(20)可知，T1展开后的第二项并不显含λ，而缩放因子S又依赖于F，因此上述单调性并不显然。请说明实现中是否对S停止了梯度传播，并通过固定网络后的参数扫描、损失剖面或时间步长敏感性分析对该解释加以检验。还需指出，特定训练方案未能恢复参数，并不意味着该参数在理论上不可辨识，英文摘要中“理论可辨识性边界”的提法宜改为对当前设置下所观察现象的描述。</w:t>
+      </w:r>
+    </w:p>
+    <w:p>
+      <w:pPr>
+        <w:spacing w:after="80" w:line="360"/>
+        <w:ind w:firstLine="480"/>
+      </w:pPr>
+      <w:r>
+        <w:rPr>
+          <w:rFonts w:ascii="Times New Roman" w:eastAsia="SimSun" w:hAnsi="Times New Roman"/>
+          <w:sz w:val="24"/>
+          <w:szCs w:val="24"/>
+        </w:rPr>
+        <w:t xml:space="preserve">5. 第1.1节称“在本文稳态框架下忽略时间导数”，但算例为瞬态流动，且一致性损失本身正是对∂τ/∂t的离散，前后表述存在矛盾。请明确式(19)中F的具体含义，给出由瞬态本构方程到式(18)的推导过程，并说明采用标准化时间步长后，时间导数与空间导数的尺度如何保持一致。摘要中“以时间递推替代高阶空间导数”的说法亦不够准确，因为本构方程仅含一阶空间导数，所替代的实际是时间导数。另外，文中给出了不可压缩条件，但损失函数中未见连续性方程残差，请说明该约束的实现方式。</w:t>
+      </w:r>
+    </w:p>
+    <w:p>
+      <w:pPr>
+        <w:spacing w:after="80" w:line="360"/>
+        <w:ind w:firstLine="480"/>
+      </w:pPr>
+      <w:r>
+        <w:rPr>
+          <w:rFonts w:ascii="Times New Roman" w:eastAsia="SimSun" w:hAnsi="Times New Roman"/>
+          <w:sz w:val="24"/>
+          <w:szCs w:val="24"/>
+        </w:rPr>
+        <w:t xml:space="preserve">6. 除速度观测外，损失函数还用到了应力初边值、压力参考值以及应力和压力的归一化统计量。建议作者区分哪些属于可独立给定的物理条件，哪些是从参考解中提取的辅助信息，并说明应力边界值是否取自参考解、标准差是否由全场数据计算，以及这些信息的使用范围。对于封闭方腔，文中的inlet、outlet及压力出口条件分别对应哪些区域，也需加以解释。在补充观测噪声和采样密度方面的验证之前，“可与粒子图像测速直接衔接”宜表述为潜在的应用方向。</w:t>
+      </w:r>
+    </w:p>
+    <w:p>
+      <w:pPr>
+        <w:spacing w:after="80" w:line="360"/>
+        <w:ind w:firstLine="480"/>
+      </w:pPr>
+      <w:r>
+        <w:rPr>
+          <w:rFonts w:ascii="Times New Roman" w:eastAsia="SimSun" w:hAnsi="Times New Roman"/>
+          <w:sz w:val="24"/>
+          <w:szCs w:val="24"/>
+        </w:rPr>
+        <w:t xml:space="preserve">7. 第2.1节给出的总时长0.03 s、输出间隔0.01 s与16个快照，按等间隔输出理解无法同时成立，请列出实际输出时刻。摘要中的“约6500个采样点”与第2.2节的1.29×10⁵个时空点之间的关系未作说明，请明确二者是否分别对应抽样观测点和全量参考数据，并分别给出观测点、配置点、初边值点和测试点的数量及采样方式。t=0时刻为已知的零初始状态，且至少应力初值已参与训练约束，以该快照作为测试集难以反映非平凡流场的重建效果；请说明测试变量与初值约束是否重叠，并在未参与训练的非零时刻或空间位置进行验证。第2.4节题为“场量预测对比”，但仅给出了损失曲线，建议补充速度、应力和压力的参考场、预测场、误差场以及相对L2误差。</w:t>
+      </w:r>
+    </w:p>
+    <w:p>
+      <w:pPr>
+        <w:spacing w:after="80" w:line="360"/>
+        <w:ind w:firstLine="480"/>
+      </w:pPr>
+      <w:r>
+        <w:rPr>
+          <w:rFonts w:ascii="Times New Roman" w:eastAsia="SimSun" w:hAnsi="Times New Roman"/>
+          <w:sz w:val="24"/>
+          <w:szCs w:val="24"/>
+        </w:rPr>
+        <w:t xml:space="preserve">8. 式(36)和式(37)对数据损失与一致性损失乘以同一系数，二者预设的相对权重并不随训练进度变化，因此仅凭这两式无法得出“训练初期数据项主导、后期物理约束充分激活”的结论。建议结合各项加权损失及其梯度贡献随训练进度的变化加以说明。此外，初始条件权重在训练初期并未降低，而是随后逐渐衰减，这一点也请与文字描述核对。</w:t>
+      </w:r>
+    </w:p>
+    <w:p>
+      <w:pPr>
+        <w:spacing w:after="80" w:line="360"/>
+        <w:ind w:firstLine="480"/>
+      </w:pPr>
+      <w:r>
+        <w:rPr>
+          <w:rFonts w:ascii="Times New Roman" w:eastAsia="SimSun" w:hAnsi="Times New Roman"/>
+          <w:sz w:val="24"/>
+          <w:szCs w:val="24"/>
+        </w:rPr>
+        <w:t xml:space="preserve">9. 文章以ViscoelasticNet为主要比较对象，但未在相同数据和训练预算下给出直接对比。第2.5节的实验主要围绕先验设置展开，参数变换、稀疏正则化、动态调度和逐点缩放各自的作用均未单独检验，因此“优于全局方差缩放”的结论缺乏定量依据。建议补充基线对比和针对性消融实验，在统一测试集上采用相同指标进行评价，并报告多次独立训练的结果；文中提到的“24组鲁棒性实验”也请列出具体配置。</w:t>
+      </w:r>
+    </w:p>
+    <w:p>
+      <w:pPr>
+        <w:spacing w:after="80" w:line="360"/>
+        <w:ind w:firstLine="480"/>
+      </w:pPr>
+      <w:r>
+        <w:rPr>
+          <w:rFonts w:ascii="Times New Roman" w:eastAsia="SimSun" w:hAnsi="Times New Roman"/>
+          <w:sz w:val="24"/>
+          <w:szCs w:val="24"/>
+        </w:rPr>
+        <w:t xml:space="preserve">10. 文中部分数值和表述前后不一致，请逐项核对：(1)第2.2节“黏度最大偏差不超过4%”应明确限定于表1的基准配置。表2中不同先验权重下，部分黏度参数误差明显增大（如Giesekus模型的ηp为0.0123～0.0151，真值为0.01），请区分基准配置下的辨识精度与先验变化下的鲁棒性，避免将前者推广为普遍结论。(2)第2.5节给出的百分比与表格不符：文中称γλ=10⁻⁵时ε误差为3%、α误差为16%，而表2对应结果约为0.7%和6.6%；又称γλ=10⁻³时ε偏离23%，按0.0797计算应约为20.3%。请明确各百分比所对应的实验组。(3)“证实了式(21)的力平衡机制”中的式(21)应为式(42)。(4)第1.4.3节所称“第3节的配置”实际指向结论章；文中虽给出了部分损失权重，但第二阶段等配置仍不完整，建议以表格形式集中给出全部超参数。(5)表1未注明所对应的γλ及其他先验配置；Giesekus和PTT模型的松弛时间真值以横线表示，而正文明确为0.1，请补齐并说明横线含义。</w:t>
+      </w:r>
+    </w:p>
+    <w:p>
+      <w:pPr>
+        <w:spacing w:after="80" w:line="360"/>
+        <w:ind w:firstLine="480"/>
+      </w:pPr>
+      <w:r>
+        <w:rPr>
+          <w:rFonts w:ascii="Times New Roman" w:eastAsia="SimSun" w:hAnsi="Times New Roman"/>
+          <w:sz w:val="24"/>
+          <w:szCs w:val="24"/>
+        </w:rPr>
+        <w:t xml:space="preserve">11. 此外，方法实现、复现信息和术语表述方面还有以下几点需要补充或规范：(1)softplus在有限输入下严格大于零，只能渐近趋于零，exp与softplus本身也均不提供上界，请将“归零”“保证有界性”等表述与实际的数值判定及裁剪操作区分开来；对于本文涉及的标量参数，建议使用“正性”或“非负性”等准确术语，并给出各参数的裁剪区间及其依据。(2)式(26)计算的是均方根而非标准差。(3)非有限导数置零、F裁剪等数值处理可能改变实际参与优化的残差，请报告其触发频率。(4)请补充迭代次数、优化器、批量大小、学习率、各损失权重、先验均值及GPU型号等复现信息。(5)英文摘要中出现的“ViscoelasticNet++”未见于中文摘要和正文，请予以统一；“黏/粘”等用字也请统一。</w:t>
       </w:r>
     </w:p>
     <w:p>
@@ -390,7 +390,7 @@
           <w:sz w:val="24"/>
           <w:szCs w:val="24"/>
         </w:rPr>
-        <w:t xml:space="preserve">本文选题有研究价值，但现有结果对模型自动甄别和参数可靠辨识的支持仍不充分。建议作者澄清模型选择流程和训练所用信息，补充关键的对照与验证结果，并核对方程、实现及数据设置后，提交修改稿重审。</w:t>
+        <w:t xml:space="preserve">本文选题具有研究价值，但现有结果对模型自动甄别和参数可靠辨识的支撑尚不充分。建议作者澄清模型选择流程和训练所用信息，补充关键的对照实验与验证结果，并对方程、实现细节及数据设置进行核对，修改后再行送审。</w:t>
       </w:r>
     </w:p>
     <w:sectPr>

</xml_diff>